<commit_message>
docs: captures d'écran dans la présentation Word et version PowerPoint
- Word : 12 captures de l'interface (missions, flotte, carburant, garage,
  facturation, trésorerie, congés, tableau de bord, espace chauffeur).
- PowerPoint de 17 diapositives avec notes de l'orateur : fonctionnalités par
  métier, droits par rôle, sécurité, exemple de mission, état d'avancement.

Co-Authored-By: Claude Sonnet 5 <noreply@anthropic.com>
</commit_message>
<xml_diff>
--- a/Presentation-ERP-DEN-Source.docx
+++ b/Presentation-ERP-DEN-Source.docx
@@ -107,7 +107,7 @@
     <w:sdt>
       <w:sdtPr>
         <w:alias w:val="Sommaire"/>
-        <w:id w:val="1101533604"/>
+        <w:id w:val="370040157"/>
       </w:sdtPr>
       <w:sdtEndPr/>
       <w:sdtContent>
@@ -135,7 +135,7 @@
           <w:r>
             <w:fldChar w:fldCharType="separate"/>
           </w:r>
-          <w:hyperlink w:anchor="_Toc240897432" w:history="1">
+          <w:hyperlink w:anchor="_Toc240898609" w:history="1">
             <w:r>
               <w:rPr>
                 <w:rStyle w:val="Lienhypertexte"/>
@@ -159,7 +159,7 @@
               <w:rPr>
                 <w:noProof/>
               </w:rPr>
-              <w:instrText xml:space="preserve"> PAGEREF _Toc240897432 \h </w:instrText>
+              <w:instrText xml:space="preserve"> PAGEREF _Toc240898609 \h </w:instrText>
             </w:r>
             <w:r>
               <w:rPr>
@@ -201,7 +201,7 @@
               <w14:ligatures w14:val="standardContextual"/>
             </w:rPr>
           </w:pPr>
-          <w:hyperlink w:anchor="_Toc240897433" w:history="1">
+          <w:hyperlink w:anchor="_Toc240898610" w:history="1">
             <w:r>
               <w:rPr>
                 <w:rStyle w:val="Lienhypertexte"/>
@@ -225,7 +225,7 @@
               <w:rPr>
                 <w:noProof/>
               </w:rPr>
-              <w:instrText xml:space="preserve"> PAGEREF _Toc240897433 \h </w:instrText>
+              <w:instrText xml:space="preserve"> PAGEREF _Toc240898610 \h </w:instrText>
             </w:r>
             <w:r>
               <w:rPr>
@@ -267,7 +267,7 @@
               <w14:ligatures w14:val="standardContextual"/>
             </w:rPr>
           </w:pPr>
-          <w:hyperlink w:anchor="_Toc240897434" w:history="1">
+          <w:hyperlink w:anchor="_Toc240898611" w:history="1">
             <w:r>
               <w:rPr>
                 <w:rStyle w:val="Lienhypertexte"/>
@@ -291,7 +291,7 @@
               <w:rPr>
                 <w:noProof/>
               </w:rPr>
-              <w:instrText xml:space="preserve"> PAGEREF _Toc240897434 \h </w:instrText>
+              <w:instrText xml:space="preserve"> PAGEREF _Toc240898611 \h </w:instrText>
             </w:r>
             <w:r>
               <w:rPr>
@@ -333,7 +333,7 @@
               <w14:ligatures w14:val="standardContextual"/>
             </w:rPr>
           </w:pPr>
-          <w:hyperlink w:anchor="_Toc240897435" w:history="1">
+          <w:hyperlink w:anchor="_Toc240898612" w:history="1">
             <w:r>
               <w:rPr>
                 <w:rStyle w:val="Lienhypertexte"/>
@@ -357,7 +357,7 @@
               <w:rPr>
                 <w:noProof/>
               </w:rPr>
-              <w:instrText xml:space="preserve"> PAGEREF _Toc240897435 \h </w:instrText>
+              <w:instrText xml:space="preserve"> PAGEREF _Toc240898612 \h </w:instrText>
             </w:r>
             <w:r>
               <w:rPr>
@@ -399,7 +399,7 @@
               <w14:ligatures w14:val="standardContextual"/>
             </w:rPr>
           </w:pPr>
-          <w:hyperlink w:anchor="_Toc240897436" w:history="1">
+          <w:hyperlink w:anchor="_Toc240898613" w:history="1">
             <w:r>
               <w:rPr>
                 <w:rStyle w:val="Lienhypertexte"/>
@@ -423,7 +423,7 @@
               <w:rPr>
                 <w:noProof/>
               </w:rPr>
-              <w:instrText xml:space="preserve"> PAGEREF _Toc240897436 \h </w:instrText>
+              <w:instrText xml:space="preserve"> PAGEREF _Toc240898613 \h </w:instrText>
             </w:r>
             <w:r>
               <w:rPr>
@@ -465,7 +465,7 @@
               <w14:ligatures w14:val="standardContextual"/>
             </w:rPr>
           </w:pPr>
-          <w:hyperlink w:anchor="_Toc240897437" w:history="1">
+          <w:hyperlink w:anchor="_Toc240898614" w:history="1">
             <w:r>
               <w:rPr>
                 <w:rStyle w:val="Lienhypertexte"/>
@@ -489,7 +489,7 @@
               <w:rPr>
                 <w:noProof/>
               </w:rPr>
-              <w:instrText xml:space="preserve"> PAGEREF _Toc240897437 \h </w:instrText>
+              <w:instrText xml:space="preserve"> PAGEREF _Toc240898614 \h </w:instrText>
             </w:r>
             <w:r>
               <w:rPr>
@@ -531,7 +531,7 @@
               <w14:ligatures w14:val="standardContextual"/>
             </w:rPr>
           </w:pPr>
-          <w:hyperlink w:anchor="_Toc240897438" w:history="1">
+          <w:hyperlink w:anchor="_Toc240898615" w:history="1">
             <w:r>
               <w:rPr>
                 <w:rStyle w:val="Lienhypertexte"/>
@@ -555,7 +555,7 @@
               <w:rPr>
                 <w:noProof/>
               </w:rPr>
-              <w:instrText xml:space="preserve"> PAGEREF _Toc240897438 \h </w:instrText>
+              <w:instrText xml:space="preserve"> PAGEREF _Toc240898615 \h </w:instrText>
             </w:r>
             <w:r>
               <w:rPr>
@@ -572,7 +572,7 @@
               <w:rPr>
                 <w:noProof/>
               </w:rPr>
-              <w:t>6</w:t>
+              <w:t>7</w:t>
             </w:r>
             <w:r>
               <w:rPr>
@@ -597,7 +597,7 @@
               <w14:ligatures w14:val="standardContextual"/>
             </w:rPr>
           </w:pPr>
-          <w:hyperlink w:anchor="_Toc240897439" w:history="1">
+          <w:hyperlink w:anchor="_Toc240898616" w:history="1">
             <w:r>
               <w:rPr>
                 <w:rStyle w:val="Lienhypertexte"/>
@@ -621,7 +621,7 @@
               <w:rPr>
                 <w:noProof/>
               </w:rPr>
-              <w:instrText xml:space="preserve"> PAGEREF _Toc240897439 \h </w:instrText>
+              <w:instrText xml:space="preserve"> PAGEREF _Toc240898616 \h </w:instrText>
             </w:r>
             <w:r>
               <w:rPr>
@@ -638,7 +638,7 @@
               <w:rPr>
                 <w:noProof/>
               </w:rPr>
-              <w:t>7</w:t>
+              <w:t>8</w:t>
             </w:r>
             <w:r>
               <w:rPr>
@@ -663,7 +663,7 @@
               <w14:ligatures w14:val="standardContextual"/>
             </w:rPr>
           </w:pPr>
-          <w:hyperlink w:anchor="_Toc240897440" w:history="1">
+          <w:hyperlink w:anchor="_Toc240898617" w:history="1">
             <w:r>
               <w:rPr>
                 <w:rStyle w:val="Lienhypertexte"/>
@@ -687,7 +687,7 @@
               <w:rPr>
                 <w:noProof/>
               </w:rPr>
-              <w:instrText xml:space="preserve"> PAGEREF _Toc240897440 \h </w:instrText>
+              <w:instrText xml:space="preserve"> PAGEREF _Toc240898617 \h </w:instrText>
             </w:r>
             <w:r>
               <w:rPr>
@@ -704,7 +704,7 @@
               <w:rPr>
                 <w:noProof/>
               </w:rPr>
-              <w:t>7</w:t>
+              <w:t>8</w:t>
             </w:r>
             <w:r>
               <w:rPr>
@@ -729,7 +729,7 @@
               <w14:ligatures w14:val="standardContextual"/>
             </w:rPr>
           </w:pPr>
-          <w:hyperlink w:anchor="_Toc240897441" w:history="1">
+          <w:hyperlink w:anchor="_Toc240898618" w:history="1">
             <w:r>
               <w:rPr>
                 <w:rStyle w:val="Lienhypertexte"/>
@@ -753,7 +753,7 @@
               <w:rPr>
                 <w:noProof/>
               </w:rPr>
-              <w:instrText xml:space="preserve"> PAGEREF _Toc240897441 \h </w:instrText>
+              <w:instrText xml:space="preserve"> PAGEREF _Toc240898618 \h </w:instrText>
             </w:r>
             <w:r>
               <w:rPr>
@@ -770,7 +770,7 @@
               <w:rPr>
                 <w:noProof/>
               </w:rPr>
-              <w:t>8</w:t>
+              <w:t>9</w:t>
             </w:r>
             <w:r>
               <w:rPr>
@@ -795,7 +795,7 @@
               <w14:ligatures w14:val="standardContextual"/>
             </w:rPr>
           </w:pPr>
-          <w:hyperlink w:anchor="_Toc240897442" w:history="1">
+          <w:hyperlink w:anchor="_Toc240898619" w:history="1">
             <w:r>
               <w:rPr>
                 <w:rStyle w:val="Lienhypertexte"/>
@@ -819,7 +819,7 @@
               <w:rPr>
                 <w:noProof/>
               </w:rPr>
-              <w:instrText xml:space="preserve"> PAGEREF _Toc240897442 \h </w:instrText>
+              <w:instrText xml:space="preserve"> PAGEREF _Toc240898619 \h </w:instrText>
             </w:r>
             <w:r>
               <w:rPr>
@@ -836,7 +836,7 @@
               <w:rPr>
                 <w:noProof/>
               </w:rPr>
-              <w:t>8</w:t>
+              <w:t>10</w:t>
             </w:r>
             <w:r>
               <w:rPr>
@@ -861,7 +861,7 @@
               <w14:ligatures w14:val="standardContextual"/>
             </w:rPr>
           </w:pPr>
-          <w:hyperlink w:anchor="_Toc240897443" w:history="1">
+          <w:hyperlink w:anchor="_Toc240898620" w:history="1">
             <w:r>
               <w:rPr>
                 <w:rStyle w:val="Lienhypertexte"/>
@@ -885,7 +885,7 @@
               <w:rPr>
                 <w:noProof/>
               </w:rPr>
-              <w:instrText xml:space="preserve"> PAGEREF _Toc240897443 \h </w:instrText>
+              <w:instrText xml:space="preserve"> PAGEREF _Toc240898620 \h </w:instrText>
             </w:r>
             <w:r>
               <w:rPr>
@@ -902,7 +902,7 @@
               <w:rPr>
                 <w:noProof/>
               </w:rPr>
-              <w:t>9</w:t>
+              <w:t>11</w:t>
             </w:r>
             <w:r>
               <w:rPr>
@@ -927,7 +927,7 @@
               <w14:ligatures w14:val="standardContextual"/>
             </w:rPr>
           </w:pPr>
-          <w:hyperlink w:anchor="_Toc240897444" w:history="1">
+          <w:hyperlink w:anchor="_Toc240898621" w:history="1">
             <w:r>
               <w:rPr>
                 <w:rStyle w:val="Lienhypertexte"/>
@@ -951,7 +951,7 @@
               <w:rPr>
                 <w:noProof/>
               </w:rPr>
-              <w:instrText xml:space="preserve"> PAGEREF _Toc240897444 \h </w:instrText>
+              <w:instrText xml:space="preserve"> PAGEREF _Toc240898621 \h </w:instrText>
             </w:r>
             <w:r>
               <w:rPr>
@@ -968,7 +968,7 @@
               <w:rPr>
                 <w:noProof/>
               </w:rPr>
-              <w:t>10</w:t>
+              <w:t>11</w:t>
             </w:r>
             <w:r>
               <w:rPr>
@@ -993,7 +993,7 @@
               <w14:ligatures w14:val="standardContextual"/>
             </w:rPr>
           </w:pPr>
-          <w:hyperlink w:anchor="_Toc240897445" w:history="1">
+          <w:hyperlink w:anchor="_Toc240898622" w:history="1">
             <w:r>
               <w:rPr>
                 <w:rStyle w:val="Lienhypertexte"/>
@@ -1017,7 +1017,7 @@
               <w:rPr>
                 <w:noProof/>
               </w:rPr>
-              <w:instrText xml:space="preserve"> PAGEREF _Toc240897445 \h </w:instrText>
+              <w:instrText xml:space="preserve"> PAGEREF _Toc240898622 \h </w:instrText>
             </w:r>
             <w:r>
               <w:rPr>
@@ -1034,7 +1034,7 @@
               <w:rPr>
                 <w:noProof/>
               </w:rPr>
-              <w:t>10</w:t>
+              <w:t>13</w:t>
             </w:r>
             <w:r>
               <w:rPr>
@@ -1059,7 +1059,7 @@
               <w14:ligatures w14:val="standardContextual"/>
             </w:rPr>
           </w:pPr>
-          <w:hyperlink w:anchor="_Toc240897446" w:history="1">
+          <w:hyperlink w:anchor="_Toc240898623" w:history="1">
             <w:r>
               <w:rPr>
                 <w:rStyle w:val="Lienhypertexte"/>
@@ -1083,7 +1083,7 @@
               <w:rPr>
                 <w:noProof/>
               </w:rPr>
-              <w:instrText xml:space="preserve"> PAGEREF _Toc240897446 \h </w:instrText>
+              <w:instrText xml:space="preserve"> PAGEREF _Toc240898623 \h </w:instrText>
             </w:r>
             <w:r>
               <w:rPr>
@@ -1100,7 +1100,7 @@
               <w:rPr>
                 <w:noProof/>
               </w:rPr>
-              <w:t>11</w:t>
+              <w:t>14</w:t>
             </w:r>
             <w:r>
               <w:rPr>
@@ -1125,7 +1125,7 @@
               <w14:ligatures w14:val="standardContextual"/>
             </w:rPr>
           </w:pPr>
-          <w:hyperlink w:anchor="_Toc240897447" w:history="1">
+          <w:hyperlink w:anchor="_Toc240898624" w:history="1">
             <w:r>
               <w:rPr>
                 <w:rStyle w:val="Lienhypertexte"/>
@@ -1149,7 +1149,7 @@
               <w:rPr>
                 <w:noProof/>
               </w:rPr>
-              <w:instrText xml:space="preserve"> PAGEREF _Toc240897447 \h </w:instrText>
+              <w:instrText xml:space="preserve"> PAGEREF _Toc240898624 \h </w:instrText>
             </w:r>
             <w:r>
               <w:rPr>
@@ -1166,7 +1166,7 @@
               <w:rPr>
                 <w:noProof/>
               </w:rPr>
-              <w:t>12</w:t>
+              <w:t>15</w:t>
             </w:r>
             <w:r>
               <w:rPr>
@@ -1191,7 +1191,7 @@
               <w14:ligatures w14:val="standardContextual"/>
             </w:rPr>
           </w:pPr>
-          <w:hyperlink w:anchor="_Toc240897448" w:history="1">
+          <w:hyperlink w:anchor="_Toc240898625" w:history="1">
             <w:r>
               <w:rPr>
                 <w:rStyle w:val="Lienhypertexte"/>
@@ -1215,7 +1215,7 @@
               <w:rPr>
                 <w:noProof/>
               </w:rPr>
-              <w:instrText xml:space="preserve"> PAGEREF _Toc240897448 \h </w:instrText>
+              <w:instrText xml:space="preserve"> PAGEREF _Toc240898625 \h </w:instrText>
             </w:r>
             <w:r>
               <w:rPr>
@@ -1232,7 +1232,7 @@
               <w:rPr>
                 <w:noProof/>
               </w:rPr>
-              <w:t>12</w:t>
+              <w:t>16</w:t>
             </w:r>
             <w:r>
               <w:rPr>
@@ -1257,7 +1257,7 @@
               <w14:ligatures w14:val="standardContextual"/>
             </w:rPr>
           </w:pPr>
-          <w:hyperlink w:anchor="_Toc240897449" w:history="1">
+          <w:hyperlink w:anchor="_Toc240898626" w:history="1">
             <w:r>
               <w:rPr>
                 <w:rStyle w:val="Lienhypertexte"/>
@@ -1281,7 +1281,7 @@
               <w:rPr>
                 <w:noProof/>
               </w:rPr>
-              <w:instrText xml:space="preserve"> PAGEREF _Toc240897449 \h </w:instrText>
+              <w:instrText xml:space="preserve"> PAGEREF _Toc240898626 \h </w:instrText>
             </w:r>
             <w:r>
               <w:rPr>
@@ -1298,7 +1298,7 @@
               <w:rPr>
                 <w:noProof/>
               </w:rPr>
-              <w:t>13</w:t>
+              <w:t>17</w:t>
             </w:r>
             <w:r>
               <w:rPr>
@@ -1323,7 +1323,7 @@
               <w14:ligatures w14:val="standardContextual"/>
             </w:rPr>
           </w:pPr>
-          <w:hyperlink w:anchor="_Toc240897450" w:history="1">
+          <w:hyperlink w:anchor="_Toc240898627" w:history="1">
             <w:r>
               <w:rPr>
                 <w:rStyle w:val="Lienhypertexte"/>
@@ -1347,7 +1347,7 @@
               <w:rPr>
                 <w:noProof/>
               </w:rPr>
-              <w:instrText xml:space="preserve"> PAGEREF _Toc240897450 \h </w:instrText>
+              <w:instrText xml:space="preserve"> PAGEREF _Toc240898627 \h </w:instrText>
             </w:r>
             <w:r>
               <w:rPr>
@@ -1364,7 +1364,7 @@
               <w:rPr>
                 <w:noProof/>
               </w:rPr>
-              <w:t>15</w:t>
+              <w:t>18</w:t>
             </w:r>
             <w:r>
               <w:rPr>
@@ -1389,7 +1389,7 @@
               <w14:ligatures w14:val="standardContextual"/>
             </w:rPr>
           </w:pPr>
-          <w:hyperlink w:anchor="_Toc240897451" w:history="1">
+          <w:hyperlink w:anchor="_Toc240898628" w:history="1">
             <w:r>
               <w:rPr>
                 <w:rStyle w:val="Lienhypertexte"/>
@@ -1413,7 +1413,7 @@
               <w:rPr>
                 <w:noProof/>
               </w:rPr>
-              <w:instrText xml:space="preserve"> PAGEREF _Toc240897451 \h </w:instrText>
+              <w:instrText xml:space="preserve"> PAGEREF _Toc240898628 \h </w:instrText>
             </w:r>
             <w:r>
               <w:rPr>
@@ -1430,7 +1430,7 @@
               <w:rPr>
                 <w:noProof/>
               </w:rPr>
-              <w:t>16</w:t>
+              <w:t>19</w:t>
             </w:r>
             <w:r>
               <w:rPr>
@@ -1455,7 +1455,7 @@
               <w14:ligatures w14:val="standardContextual"/>
             </w:rPr>
           </w:pPr>
-          <w:hyperlink w:anchor="_Toc240897452" w:history="1">
+          <w:hyperlink w:anchor="_Toc240898629" w:history="1">
             <w:r>
               <w:rPr>
                 <w:rStyle w:val="Lienhypertexte"/>
@@ -1479,7 +1479,7 @@
               <w:rPr>
                 <w:noProof/>
               </w:rPr>
-              <w:instrText xml:space="preserve"> PAGEREF _Toc240897452 \h </w:instrText>
+              <w:instrText xml:space="preserve"> PAGEREF _Toc240898629 \h </w:instrText>
             </w:r>
             <w:r>
               <w:rPr>
@@ -1496,7 +1496,7 @@
               <w:rPr>
                 <w:noProof/>
               </w:rPr>
-              <w:t>16</w:t>
+              <w:t>19</w:t>
             </w:r>
             <w:r>
               <w:rPr>
@@ -1521,7 +1521,7 @@
               <w14:ligatures w14:val="standardContextual"/>
             </w:rPr>
           </w:pPr>
-          <w:hyperlink w:anchor="_Toc240897453" w:history="1">
+          <w:hyperlink w:anchor="_Toc240898630" w:history="1">
             <w:r>
               <w:rPr>
                 <w:rStyle w:val="Lienhypertexte"/>
@@ -1545,7 +1545,7 @@
               <w:rPr>
                 <w:noProof/>
               </w:rPr>
-              <w:instrText xml:space="preserve"> PAGEREF _Toc240897453 \h </w:instrText>
+              <w:instrText xml:space="preserve"> PAGEREF _Toc240898630 \h </w:instrText>
             </w:r>
             <w:r>
               <w:rPr>
@@ -1562,7 +1562,7 @@
               <w:rPr>
                 <w:noProof/>
               </w:rPr>
-              <w:t>16</w:t>
+              <w:t>19</w:t>
             </w:r>
             <w:r>
               <w:rPr>
@@ -1587,7 +1587,7 @@
               <w14:ligatures w14:val="standardContextual"/>
             </w:rPr>
           </w:pPr>
-          <w:hyperlink w:anchor="_Toc240897454" w:history="1">
+          <w:hyperlink w:anchor="_Toc240898631" w:history="1">
             <w:r>
               <w:rPr>
                 <w:rStyle w:val="Lienhypertexte"/>
@@ -1611,7 +1611,7 @@
               <w:rPr>
                 <w:noProof/>
               </w:rPr>
-              <w:instrText xml:space="preserve"> PAGEREF _Toc240897454 \h </w:instrText>
+              <w:instrText xml:space="preserve"> PAGEREF _Toc240898631 \h </w:instrText>
             </w:r>
             <w:r>
               <w:rPr>
@@ -1628,7 +1628,7 @@
               <w:rPr>
                 <w:noProof/>
               </w:rPr>
-              <w:t>16</w:t>
+              <w:t>19</w:t>
             </w:r>
             <w:r>
               <w:rPr>
@@ -1653,7 +1653,7 @@
               <w14:ligatures w14:val="standardContextual"/>
             </w:rPr>
           </w:pPr>
-          <w:hyperlink w:anchor="_Toc240897455" w:history="1">
+          <w:hyperlink w:anchor="_Toc240898632" w:history="1">
             <w:r>
               <w:rPr>
                 <w:rStyle w:val="Lienhypertexte"/>
@@ -1677,7 +1677,7 @@
               <w:rPr>
                 <w:noProof/>
               </w:rPr>
-              <w:instrText xml:space="preserve"> PAGEREF _Toc240897455 \h </w:instrText>
+              <w:instrText xml:space="preserve"> PAGEREF _Toc240898632 \h </w:instrText>
             </w:r>
             <w:r>
               <w:rPr>
@@ -1694,7 +1694,7 @@
               <w:rPr>
                 <w:noProof/>
               </w:rPr>
-              <w:t>17</w:t>
+              <w:t>20</w:t>
             </w:r>
             <w:r>
               <w:rPr>
@@ -1735,7 +1735,7 @@
       <w:pPr>
         <w:pStyle w:val="Titre1"/>
       </w:pPr>
-      <w:bookmarkStart w:id="0" w:name="_Toc240897432"/>
+      <w:bookmarkStart w:id="0" w:name="_Toc240898609"/>
       <w:r>
         <w:lastRenderedPageBreak/>
         <w:t>1. L’essentiel en une page</w:t>
@@ -1968,6 +1968,9 @@
             <w:bottom w:w="0" w:type="dxa"/>
           </w:tblCellMar>
         </w:tblPrEx>
+        <w:trPr>
+          <w:cantSplit/>
+        </w:trPr>
         <w:tc>
           <w:tcPr>
             <w:tcW w:w="9638" w:type="dxa"/>
@@ -2038,7 +2041,7 @@
       <w:pPr>
         <w:pStyle w:val="Titre1"/>
       </w:pPr>
-      <w:bookmarkStart w:id="1" w:name="_Toc240897433"/>
+      <w:bookmarkStart w:id="1" w:name="_Toc240898610"/>
       <w:r>
         <w:lastRenderedPageBreak/>
         <w:t>2. Vue d’ensemble</w:t>
@@ -3133,7 +3136,7 @@
       <w:pPr>
         <w:pStyle w:val="Titre2"/>
       </w:pPr>
-      <w:bookmarkStart w:id="2" w:name="_Toc240897434"/>
+      <w:bookmarkStart w:id="2" w:name="_Toc240898611"/>
       <w:r>
         <w:t>Les sept rôles</w:t>
       </w:r>
@@ -3764,7 +3767,7 @@
       <w:pPr>
         <w:pStyle w:val="Titre1"/>
       </w:pPr>
-      <w:bookmarkStart w:id="3" w:name="_Toc240897435"/>
+      <w:bookmarkStart w:id="3" w:name="_Toc240898612"/>
       <w:r>
         <w:t>3. Qui peut faire quoi</w:t>
       </w:r>
@@ -7319,7 +7322,7 @@
       <w:pPr>
         <w:pStyle w:val="Titre1"/>
       </w:pPr>
-      <w:bookmarkStart w:id="4" w:name="_Toc240897436"/>
+      <w:bookmarkStart w:id="4" w:name="_Toc240898613"/>
       <w:r>
         <w:lastRenderedPageBreak/>
         <w:t>4. Les fonctionnalités, module par module</w:t>
@@ -7330,7 +7333,7 @@
       <w:pPr>
         <w:pStyle w:val="Titre2"/>
       </w:pPr>
-      <w:bookmarkStart w:id="5" w:name="_Toc240897437"/>
+      <w:bookmarkStart w:id="5" w:name="_Toc240898614"/>
       <w:r>
         <w:t>4.1 Missions</w:t>
       </w:r>
@@ -7342,6 +7345,73 @@
       </w:pPr>
       <w:r>
         <w:t>Une mission est un transport confié par un client : d’où on charge, où on livre, quelle marchandise, quel poids, à quel prix. L’application suit la mission de sa création à sa clôture.</w:t>
+      </w:r>
+    </w:p>
+    <w:p>
+      <w:pPr>
+        <w:keepNext/>
+        <w:keepLines/>
+        <w:spacing w:before="120" w:after="60"/>
+        <w:jc w:val="center"/>
+      </w:pPr>
+      <w:r>
+        <w:rPr>
+          <w:noProof/>
+        </w:rPr>
+        <w:drawing>
+          <wp:inline distT="0" distB="0" distL="0" distR="0" wp14:anchorId="6669818E" wp14:editId="789BFF05">
+            <wp:extent cx="5143500" cy="3571875"/>
+            <wp:effectExtent l="0" t="0" r="0" b="0"/>
+            <wp:docPr id="1" name="mission_fiche" descr="Fiche d’une mission : frise du cycle de vie, camion et chauffeur, codes de confirmation et QR." title="Fiche d’une mission : frise du cycle de vie, camion et chauffeur, codes de confirmation et QR."/>
+            <wp:cNvGraphicFramePr>
+              <a:graphicFrameLocks xmlns:a="http://schemas.openxmlformats.org/drawingml/2006/main" noChangeAspect="1"/>
+            </wp:cNvGraphicFramePr>
+            <a:graphic xmlns:a="http://schemas.openxmlformats.org/drawingml/2006/main">
+              <a:graphicData uri="http://schemas.openxmlformats.org/drawingml/2006/picture">
+                <pic:pic xmlns:pic="http://schemas.openxmlformats.org/drawingml/2006/picture">
+                  <pic:nvPicPr>
+                    <pic:cNvPr id="0" name=""/>
+                    <pic:cNvPicPr>
+                      <a:picLocks noChangeAspect="1" noChangeArrowheads="1"/>
+                    </pic:cNvPicPr>
+                  </pic:nvPicPr>
+                  <pic:blipFill>
+                    <a:blip r:embed="rId7"/>
+                    <a:srcRect/>
+                    <a:stretch>
+                      <a:fillRect/>
+                    </a:stretch>
+                  </pic:blipFill>
+                  <pic:spPr bwMode="auto">
+                    <a:xfrm>
+                      <a:off x="0" y="0"/>
+                      <a:ext cx="5143500" cy="3571875"/>
+                    </a:xfrm>
+                    <a:prstGeom prst="rect">
+                      <a:avLst/>
+                    </a:prstGeom>
+                  </pic:spPr>
+                </pic:pic>
+              </a:graphicData>
+            </a:graphic>
+          </wp:inline>
+        </w:drawing>
+      </w:r>
+    </w:p>
+    <w:p>
+      <w:pPr>
+        <w:spacing w:after="200"/>
+        <w:jc w:val="center"/>
+      </w:pPr>
+      <w:r>
+        <w:rPr>
+          <w:i/>
+          <w:iCs/>
+          <w:color w:val="5B5B5B"/>
+          <w:sz w:val="18"/>
+          <w:szCs w:val="18"/>
+        </w:rPr>
+        <w:t>Fiche d’une mission : frise du cycle de vie, camion et chauffeur, codes de confirmation et QR.</w:t>
       </w:r>
     </w:p>
     <w:p>
@@ -7518,6 +7588,7 @@
         <w:spacing w:after="60" w:line="276" w:lineRule="auto"/>
       </w:pPr>
       <w:r>
+        <w:lastRenderedPageBreak/>
         <w:t xml:space="preserve">Chaque code est représenté par un </w:t>
       </w:r>
       <w:r>
@@ -7571,6 +7642,9 @@
             <w:bottom w:w="0" w:type="dxa"/>
           </w:tblCellMar>
         </w:tblPrEx>
+        <w:trPr>
+          <w:cantSplit/>
+        </w:trPr>
         <w:tc>
           <w:tcPr>
             <w:tcW w:w="9638" w:type="dxa"/>
@@ -7625,7 +7699,7 @@
       <w:pPr>
         <w:pStyle w:val="Titre2"/>
       </w:pPr>
-      <w:bookmarkStart w:id="6" w:name="_Toc240897438"/>
+      <w:bookmarkStart w:id="6" w:name="_Toc240898615"/>
       <w:r>
         <w:t>4.2 Flotte : les camions</w:t>
       </w:r>
@@ -7637,6 +7711,73 @@
       </w:pPr>
       <w:r>
         <w:t>La fiche de chaque camion rassemble son identité, son état, ses documents réglementaires et son historique d’entretien.</w:t>
+      </w:r>
+    </w:p>
+    <w:p>
+      <w:pPr>
+        <w:keepNext/>
+        <w:keepLines/>
+        <w:spacing w:before="120" w:after="60"/>
+        <w:jc w:val="center"/>
+      </w:pPr>
+      <w:r>
+        <w:rPr>
+          <w:noProof/>
+        </w:rPr>
+        <w:drawing>
+          <wp:inline distT="0" distB="0" distL="0" distR="0" wp14:anchorId="13936C3D" wp14:editId="19AC18BC">
+            <wp:extent cx="5334000" cy="3333750"/>
+            <wp:effectExtent l="0" t="0" r="0" b="0"/>
+            <wp:docPr id="2" name="flotte" descr="Liste des camions, avec leur état calculé et l’alerte de documents à renouveler." title="Liste des camions, avec leur état calculé et l’alerte de documents à renouveler."/>
+            <wp:cNvGraphicFramePr>
+              <a:graphicFrameLocks xmlns:a="http://schemas.openxmlformats.org/drawingml/2006/main" noChangeAspect="1"/>
+            </wp:cNvGraphicFramePr>
+            <a:graphic xmlns:a="http://schemas.openxmlformats.org/drawingml/2006/main">
+              <a:graphicData uri="http://schemas.openxmlformats.org/drawingml/2006/picture">
+                <pic:pic xmlns:pic="http://schemas.openxmlformats.org/drawingml/2006/picture">
+                  <pic:nvPicPr>
+                    <pic:cNvPr id="0" name=""/>
+                    <pic:cNvPicPr>
+                      <a:picLocks noChangeAspect="1" noChangeArrowheads="1"/>
+                    </pic:cNvPicPr>
+                  </pic:nvPicPr>
+                  <pic:blipFill>
+                    <a:blip r:embed="rId8"/>
+                    <a:srcRect/>
+                    <a:stretch>
+                      <a:fillRect/>
+                    </a:stretch>
+                  </pic:blipFill>
+                  <pic:spPr bwMode="auto">
+                    <a:xfrm>
+                      <a:off x="0" y="0"/>
+                      <a:ext cx="5334000" cy="3333750"/>
+                    </a:xfrm>
+                    <a:prstGeom prst="rect">
+                      <a:avLst/>
+                    </a:prstGeom>
+                  </pic:spPr>
+                </pic:pic>
+              </a:graphicData>
+            </a:graphic>
+          </wp:inline>
+        </w:drawing>
+      </w:r>
+    </w:p>
+    <w:p>
+      <w:pPr>
+        <w:spacing w:after="200"/>
+        <w:jc w:val="center"/>
+      </w:pPr>
+      <w:r>
+        <w:rPr>
+          <w:i/>
+          <w:iCs/>
+          <w:color w:val="5B5B5B"/>
+          <w:sz w:val="18"/>
+          <w:szCs w:val="18"/>
+        </w:rPr>
+        <w:t>Liste des camions, avec leur état calculé et l’alerte de documents à renouveler.</w:t>
       </w:r>
     </w:p>
     <w:p>
@@ -7714,7 +7855,6 @@
         <w:pStyle w:val="Titre3"/>
       </w:pPr>
       <w:r>
-        <w:lastRenderedPageBreak/>
         <w:t>Ce que le système fait pour vous</w:t>
       </w:r>
     </w:p>
@@ -7798,6 +7938,9 @@
             <w:bottom w:w="0" w:type="dxa"/>
           </w:tblCellMar>
         </w:tblPrEx>
+        <w:trPr>
+          <w:cantSplit/>
+        </w:trPr>
         <w:tc>
           <w:tcPr>
             <w:tcW w:w="9638" w:type="dxa"/>
@@ -7825,6 +7968,7 @@
                 <w:bCs/>
                 <w:color w:val="8B0319"/>
               </w:rPr>
+              <w:lastRenderedPageBreak/>
               <w:t>Qui y accède</w:t>
             </w:r>
           </w:p>
@@ -7852,7 +7996,7 @@
       <w:pPr>
         <w:pStyle w:val="Titre2"/>
       </w:pPr>
-      <w:bookmarkStart w:id="7" w:name="_Toc240897439"/>
+      <w:bookmarkStart w:id="7" w:name="_Toc240898616"/>
       <w:r>
         <w:t>4.3 Chauffeurs</w:t>
       </w:r>
@@ -8011,6 +8155,9 @@
             <w:bottom w:w="0" w:type="dxa"/>
           </w:tblCellMar>
         </w:tblPrEx>
+        <w:trPr>
+          <w:cantSplit/>
+        </w:trPr>
         <w:tc>
           <w:tcPr>
             <w:tcW w:w="9638" w:type="dxa"/>
@@ -8065,7 +8212,7 @@
       <w:pPr>
         <w:pStyle w:val="Titre2"/>
       </w:pPr>
-      <w:bookmarkStart w:id="8" w:name="_Toc240897440"/>
+      <w:bookmarkStart w:id="8" w:name="_Toc240898617"/>
       <w:r>
         <w:t>4.4 Garage : réparations, incidents et check-lists</w:t>
       </w:r>
@@ -8081,9 +8228,77 @@
     </w:p>
     <w:p>
       <w:pPr>
+        <w:keepNext/>
+        <w:keepLines/>
+        <w:spacing w:before="120" w:after="60"/>
+        <w:jc w:val="center"/>
+      </w:pPr>
+      <w:r>
+        <w:rPr>
+          <w:noProof/>
+        </w:rPr>
+        <w:drawing>
+          <wp:inline distT="0" distB="0" distL="0" distR="0" wp14:anchorId="7A3D9D17" wp14:editId="28C06F6C">
+            <wp:extent cx="5334000" cy="3333750"/>
+            <wp:effectExtent l="0" t="0" r="0" b="0"/>
+            <wp:docPr id="3" name="incidents" descr="Incidents signalés par les chauffeurs, à traiter par le Parc auto." title="Incidents signalés par les chauffeurs, à traiter par le Parc auto."/>
+            <wp:cNvGraphicFramePr>
+              <a:graphicFrameLocks xmlns:a="http://schemas.openxmlformats.org/drawingml/2006/main" noChangeAspect="1"/>
+            </wp:cNvGraphicFramePr>
+            <a:graphic xmlns:a="http://schemas.openxmlformats.org/drawingml/2006/main">
+              <a:graphicData uri="http://schemas.openxmlformats.org/drawingml/2006/picture">
+                <pic:pic xmlns:pic="http://schemas.openxmlformats.org/drawingml/2006/picture">
+                  <pic:nvPicPr>
+                    <pic:cNvPr id="0" name=""/>
+                    <pic:cNvPicPr>
+                      <a:picLocks noChangeAspect="1" noChangeArrowheads="1"/>
+                    </pic:cNvPicPr>
+                  </pic:nvPicPr>
+                  <pic:blipFill>
+                    <a:blip r:embed="rId9"/>
+                    <a:srcRect/>
+                    <a:stretch>
+                      <a:fillRect/>
+                    </a:stretch>
+                  </pic:blipFill>
+                  <pic:spPr bwMode="auto">
+                    <a:xfrm>
+                      <a:off x="0" y="0"/>
+                      <a:ext cx="5334000" cy="3333750"/>
+                    </a:xfrm>
+                    <a:prstGeom prst="rect">
+                      <a:avLst/>
+                    </a:prstGeom>
+                  </pic:spPr>
+                </pic:pic>
+              </a:graphicData>
+            </a:graphic>
+          </wp:inline>
+        </w:drawing>
+      </w:r>
+    </w:p>
+    <w:p>
+      <w:pPr>
+        <w:spacing w:after="200"/>
+        <w:jc w:val="center"/>
+      </w:pPr>
+      <w:r>
+        <w:rPr>
+          <w:i/>
+          <w:iCs/>
+          <w:color w:val="5B5B5B"/>
+          <w:sz w:val="18"/>
+          <w:szCs w:val="18"/>
+        </w:rPr>
+        <w:t>Incidents signalés par les chauffeurs, à traiter par le Parc auto.</w:t>
+      </w:r>
+    </w:p>
+    <w:p>
+      <w:pPr>
         <w:pStyle w:val="Titre3"/>
       </w:pPr>
       <w:r>
+        <w:lastRenderedPageBreak/>
         <w:t>Ce que vous pouvez faire</w:t>
       </w:r>
     </w:p>
@@ -8224,7 +8439,6 @@
         <w:pStyle w:val="Titre3"/>
       </w:pPr>
       <w:r>
-        <w:lastRenderedPageBreak/>
         <w:t>Ce que le système fait pour vous</w:t>
       </w:r>
     </w:p>
@@ -8341,6 +8555,9 @@
             <w:bottom w:w="0" w:type="dxa"/>
           </w:tblCellMar>
         </w:tblPrEx>
+        <w:trPr>
+          <w:cantSplit/>
+        </w:trPr>
         <w:tc>
           <w:tcPr>
             <w:tcW w:w="9638" w:type="dxa"/>
@@ -8395,7 +8612,7 @@
       <w:pPr>
         <w:pStyle w:val="Titre2"/>
       </w:pPr>
-      <w:bookmarkStart w:id="9" w:name="_Toc240897441"/>
+      <w:bookmarkStart w:id="9" w:name="_Toc240898618"/>
       <w:r>
         <w:t>4.5 Stock de pièces détachées</w:t>
       </w:r>
@@ -8633,6 +8850,9 @@
             <w:bottom w:w="0" w:type="dxa"/>
           </w:tblCellMar>
         </w:tblPrEx>
+        <w:trPr>
+          <w:cantSplit/>
+        </w:trPr>
         <w:tc>
           <w:tcPr>
             <w:tcW w:w="9638" w:type="dxa"/>
@@ -8660,6 +8880,7 @@
                 <w:bCs/>
                 <w:color w:val="8B0319"/>
               </w:rPr>
+              <w:lastRenderedPageBreak/>
               <w:t>Qui y accède</w:t>
             </w:r>
           </w:p>
@@ -8687,7 +8908,7 @@
       <w:pPr>
         <w:pStyle w:val="Titre2"/>
       </w:pPr>
-      <w:bookmarkStart w:id="10" w:name="_Toc240897442"/>
+      <w:bookmarkStart w:id="10" w:name="_Toc240898619"/>
       <w:r>
         <w:t>4.6 Carburant</w:t>
       </w:r>
@@ -8699,6 +8920,73 @@
       </w:pPr>
       <w:r>
         <w:t>Chaque plein est enregistré et sa consommation est calculée pour repérer rapidement les anomalies : fuite, vol, erreur de saisie, conduite à revoir.</w:t>
+      </w:r>
+    </w:p>
+    <w:p>
+      <w:pPr>
+        <w:keepNext/>
+        <w:keepLines/>
+        <w:spacing w:before="120" w:after="60"/>
+        <w:jc w:val="center"/>
+      </w:pPr>
+      <w:r>
+        <w:rPr>
+          <w:noProof/>
+        </w:rPr>
+        <w:drawing>
+          <wp:inline distT="0" distB="0" distL="0" distR="0" wp14:anchorId="797F43A5" wp14:editId="225300BD">
+            <wp:extent cx="5334000" cy="3333750"/>
+            <wp:effectExtent l="0" t="0" r="0" b="0"/>
+            <wp:docPr id="4" name="carburant" descr="Pleins de carburant, consommation aux 100 km et alertes d’écart." title="Pleins de carburant, consommation aux 100 km et alertes d’écart."/>
+            <wp:cNvGraphicFramePr>
+              <a:graphicFrameLocks xmlns:a="http://schemas.openxmlformats.org/drawingml/2006/main" noChangeAspect="1"/>
+            </wp:cNvGraphicFramePr>
+            <a:graphic xmlns:a="http://schemas.openxmlformats.org/drawingml/2006/main">
+              <a:graphicData uri="http://schemas.openxmlformats.org/drawingml/2006/picture">
+                <pic:pic xmlns:pic="http://schemas.openxmlformats.org/drawingml/2006/picture">
+                  <pic:nvPicPr>
+                    <pic:cNvPr id="0" name=""/>
+                    <pic:cNvPicPr>
+                      <a:picLocks noChangeAspect="1" noChangeArrowheads="1"/>
+                    </pic:cNvPicPr>
+                  </pic:nvPicPr>
+                  <pic:blipFill>
+                    <a:blip r:embed="rId10"/>
+                    <a:srcRect/>
+                    <a:stretch>
+                      <a:fillRect/>
+                    </a:stretch>
+                  </pic:blipFill>
+                  <pic:spPr bwMode="auto">
+                    <a:xfrm>
+                      <a:off x="0" y="0"/>
+                      <a:ext cx="5334000" cy="3333750"/>
+                    </a:xfrm>
+                    <a:prstGeom prst="rect">
+                      <a:avLst/>
+                    </a:prstGeom>
+                  </pic:spPr>
+                </pic:pic>
+              </a:graphicData>
+            </a:graphic>
+          </wp:inline>
+        </w:drawing>
+      </w:r>
+    </w:p>
+    <w:p>
+      <w:pPr>
+        <w:spacing w:after="200"/>
+        <w:jc w:val="center"/>
+      </w:pPr>
+      <w:r>
+        <w:rPr>
+          <w:i/>
+          <w:iCs/>
+          <w:color w:val="5B5B5B"/>
+          <w:sz w:val="18"/>
+          <w:szCs w:val="18"/>
+        </w:rPr>
+        <w:t>Pleins de carburant, consommation aux 100 km et alertes d’écart.</w:t>
       </w:r>
     </w:p>
     <w:p>
@@ -8732,7 +9020,6 @@
         <w:spacing w:after="60" w:line="276" w:lineRule="auto"/>
       </w:pPr>
       <w:r>
-        <w:lastRenderedPageBreak/>
         <w:t xml:space="preserve">Consulter la liste des pleins (filtres par camion, chauffeur, période, type d’alerte) et la </w:t>
       </w:r>
       <w:r>
@@ -8900,6 +9187,9 @@
             <w:bottom w:w="0" w:type="dxa"/>
           </w:tblCellMar>
         </w:tblPrEx>
+        <w:trPr>
+          <w:cantSplit/>
+        </w:trPr>
         <w:tc>
           <w:tcPr>
             <w:tcW w:w="9638" w:type="dxa"/>
@@ -8927,6 +9217,7 @@
                 <w:bCs/>
                 <w:color w:val="8B0319"/>
               </w:rPr>
+              <w:lastRenderedPageBreak/>
               <w:t>Qui y accède</w:t>
             </w:r>
           </w:p>
@@ -8954,7 +9245,7 @@
       <w:pPr>
         <w:pStyle w:val="Titre2"/>
       </w:pPr>
-      <w:bookmarkStart w:id="11" w:name="_Toc240897443"/>
+      <w:bookmarkStart w:id="11" w:name="_Toc240898620"/>
       <w:r>
         <w:t>4.7 Clients</w:t>
       </w:r>
@@ -9129,6 +9420,9 @@
             <w:bottom w:w="0" w:type="dxa"/>
           </w:tblCellMar>
         </w:tblPrEx>
+        <w:trPr>
+          <w:cantSplit/>
+        </w:trPr>
         <w:tc>
           <w:tcPr>
             <w:tcW w:w="9638" w:type="dxa"/>
@@ -9206,6 +9500,9 @@
             <w:bottom w:w="0" w:type="dxa"/>
           </w:tblCellMar>
         </w:tblPrEx>
+        <w:trPr>
+          <w:cantSplit/>
+        </w:trPr>
         <w:tc>
           <w:tcPr>
             <w:tcW w:w="9638" w:type="dxa"/>
@@ -9260,19 +9557,86 @@
       <w:pPr>
         <w:pStyle w:val="Titre2"/>
       </w:pPr>
-      <w:bookmarkStart w:id="12" w:name="_Toc240897444"/>
-      <w:r>
+      <w:bookmarkStart w:id="12" w:name="_Toc240898621"/>
+      <w:r>
+        <w:t>4.8 Personnel et congés</w:t>
+      </w:r>
+      <w:bookmarkEnd w:id="12"/>
+    </w:p>
+    <w:p>
+      <w:pPr>
+        <w:spacing w:after="120" w:line="288" w:lineRule="auto"/>
+      </w:pPr>
+      <w:r>
+        <w:t>Les fiches du personnel, le recrutement et un circuit de validation des congés en trois étapes.</w:t>
+      </w:r>
+    </w:p>
+    <w:p>
+      <w:pPr>
+        <w:keepNext/>
+        <w:keepLines/>
+        <w:spacing w:before="120" w:after="60"/>
+        <w:jc w:val="center"/>
+      </w:pPr>
+      <w:r>
+        <w:rPr>
+          <w:noProof/>
+        </w:rPr>
         <w:lastRenderedPageBreak/>
-        <w:t>4.8 Personnel et congés</w:t>
-      </w:r>
-      <w:bookmarkEnd w:id="12"/>
-    </w:p>
-    <w:p>
-      <w:pPr>
-        <w:spacing w:after="120" w:line="288" w:lineRule="auto"/>
-      </w:pPr>
-      <w:r>
-        <w:t>Les fiches du personnel, le recrutement et un circuit de validation des congés en trois étapes.</w:t>
+        <w:drawing>
+          <wp:inline distT="0" distB="0" distL="0" distR="0" wp14:anchorId="6550066F" wp14:editId="4A13BDDE">
+            <wp:extent cx="5334000" cy="3333750"/>
+            <wp:effectExtent l="0" t="0" r="0" b="0"/>
+            <wp:docPr id="5" name="conges" descr="Congés : demandes, validations à faire et solde de jours." title="Congés : demandes, validations à faire et solde de jours."/>
+            <wp:cNvGraphicFramePr>
+              <a:graphicFrameLocks xmlns:a="http://schemas.openxmlformats.org/drawingml/2006/main" noChangeAspect="1"/>
+            </wp:cNvGraphicFramePr>
+            <a:graphic xmlns:a="http://schemas.openxmlformats.org/drawingml/2006/main">
+              <a:graphicData uri="http://schemas.openxmlformats.org/drawingml/2006/picture">
+                <pic:pic xmlns:pic="http://schemas.openxmlformats.org/drawingml/2006/picture">
+                  <pic:nvPicPr>
+                    <pic:cNvPr id="0" name=""/>
+                    <pic:cNvPicPr>
+                      <a:picLocks noChangeAspect="1" noChangeArrowheads="1"/>
+                    </pic:cNvPicPr>
+                  </pic:nvPicPr>
+                  <pic:blipFill>
+                    <a:blip r:embed="rId11"/>
+                    <a:srcRect/>
+                    <a:stretch>
+                      <a:fillRect/>
+                    </a:stretch>
+                  </pic:blipFill>
+                  <pic:spPr bwMode="auto">
+                    <a:xfrm>
+                      <a:off x="0" y="0"/>
+                      <a:ext cx="5334000" cy="3333750"/>
+                    </a:xfrm>
+                    <a:prstGeom prst="rect">
+                      <a:avLst/>
+                    </a:prstGeom>
+                  </pic:spPr>
+                </pic:pic>
+              </a:graphicData>
+            </a:graphic>
+          </wp:inline>
+        </w:drawing>
+      </w:r>
+    </w:p>
+    <w:p>
+      <w:pPr>
+        <w:spacing w:after="200"/>
+        <w:jc w:val="center"/>
+      </w:pPr>
+      <w:r>
+        <w:rPr>
+          <w:i/>
+          <w:iCs/>
+          <w:color w:val="5B5B5B"/>
+          <w:sz w:val="18"/>
+          <w:szCs w:val="18"/>
+        </w:rPr>
+        <w:t>Congés : demandes, validations à faire et solde de jours.</w:t>
       </w:r>
     </w:p>
     <w:p>
@@ -9519,6 +9883,9 @@
             <w:bottom w:w="0" w:type="dxa"/>
           </w:tblCellMar>
         </w:tblPrEx>
+        <w:trPr>
+          <w:cantSplit/>
+        </w:trPr>
         <w:tc>
           <w:tcPr>
             <w:tcW w:w="9638" w:type="dxa"/>
@@ -9596,6 +9963,9 @@
             <w:bottom w:w="0" w:type="dxa"/>
           </w:tblCellMar>
         </w:tblPrEx>
+        <w:trPr>
+          <w:cantSplit/>
+        </w:trPr>
         <w:tc>
           <w:tcPr>
             <w:tcW w:w="9638" w:type="dxa"/>
@@ -9623,6 +9993,7 @@
                 <w:bCs/>
                 <w:color w:val="F28A14"/>
               </w:rPr>
+              <w:lastRenderedPageBreak/>
               <w:t>Pas encore disponible</w:t>
             </w:r>
           </w:p>
@@ -9650,7 +10021,7 @@
       <w:pPr>
         <w:pStyle w:val="Titre2"/>
       </w:pPr>
-      <w:bookmarkStart w:id="13" w:name="_Toc240897445"/>
+      <w:bookmarkStart w:id="13" w:name="_Toc240898622"/>
       <w:r>
         <w:t>4.9 Facturation et dépenses</w:t>
       </w:r>
@@ -9662,6 +10033,73 @@
       </w:pPr>
       <w:r>
         <w:t>De la mission livrée au règlement de la facture, avec un circuit de validation clair.</w:t>
+      </w:r>
+    </w:p>
+    <w:p>
+      <w:pPr>
+        <w:keepNext/>
+        <w:keepLines/>
+        <w:spacing w:before="120" w:after="60"/>
+        <w:jc w:val="center"/>
+      </w:pPr>
+      <w:r>
+        <w:rPr>
+          <w:noProof/>
+        </w:rPr>
+        <w:drawing>
+          <wp:inline distT="0" distB="0" distL="0" distR="0" wp14:anchorId="7267DCEA" wp14:editId="1592F319">
+            <wp:extent cx="5143500" cy="3571875"/>
+            <wp:effectExtent l="0" t="0" r="0" b="0"/>
+            <wp:docPr id="6" name="facture" descr="Une facture à valider : lignes, TVA, total et conditions de paiement." title="Une facture à valider : lignes, TVA, total et conditions de paiement."/>
+            <wp:cNvGraphicFramePr>
+              <a:graphicFrameLocks xmlns:a="http://schemas.openxmlformats.org/drawingml/2006/main" noChangeAspect="1"/>
+            </wp:cNvGraphicFramePr>
+            <a:graphic xmlns:a="http://schemas.openxmlformats.org/drawingml/2006/main">
+              <a:graphicData uri="http://schemas.openxmlformats.org/drawingml/2006/picture">
+                <pic:pic xmlns:pic="http://schemas.openxmlformats.org/drawingml/2006/picture">
+                  <pic:nvPicPr>
+                    <pic:cNvPr id="0" name=""/>
+                    <pic:cNvPicPr>
+                      <a:picLocks noChangeAspect="1" noChangeArrowheads="1"/>
+                    </pic:cNvPicPr>
+                  </pic:nvPicPr>
+                  <pic:blipFill>
+                    <a:blip r:embed="rId12"/>
+                    <a:srcRect/>
+                    <a:stretch>
+                      <a:fillRect/>
+                    </a:stretch>
+                  </pic:blipFill>
+                  <pic:spPr bwMode="auto">
+                    <a:xfrm>
+                      <a:off x="0" y="0"/>
+                      <a:ext cx="5143500" cy="3571875"/>
+                    </a:xfrm>
+                    <a:prstGeom prst="rect">
+                      <a:avLst/>
+                    </a:prstGeom>
+                  </pic:spPr>
+                </pic:pic>
+              </a:graphicData>
+            </a:graphic>
+          </wp:inline>
+        </w:drawing>
+      </w:r>
+    </w:p>
+    <w:p>
+      <w:pPr>
+        <w:spacing w:after="200"/>
+        <w:jc w:val="center"/>
+      </w:pPr>
+      <w:r>
+        <w:rPr>
+          <w:i/>
+          <w:iCs/>
+          <w:color w:val="5B5B5B"/>
+          <w:sz w:val="18"/>
+          <w:szCs w:val="18"/>
+        </w:rPr>
+        <w:t>Une facture à valider : lignes, TVA, total et conditions de paiement.</w:t>
       </w:r>
     </w:p>
     <w:p>
@@ -9732,7 +10170,6 @@
         <w:spacing w:after="60" w:line="276" w:lineRule="auto"/>
       </w:pPr>
       <w:r>
-        <w:lastRenderedPageBreak/>
         <w:t xml:space="preserve">Enregistrer les </w:t>
       </w:r>
       <w:r>
@@ -9866,6 +10303,7 @@
         <w:spacing w:after="60" w:line="276" w:lineRule="auto"/>
       </w:pPr>
       <w:r>
+        <w:lastRenderedPageBreak/>
         <w:t xml:space="preserve">La validation fixe la date d’émission, l’échéance (émission + délai de paiement du client) et </w:t>
       </w:r>
       <w:r>
@@ -9955,6 +10393,9 @@
             <w:bottom w:w="0" w:type="dxa"/>
           </w:tblCellMar>
         </w:tblPrEx>
+        <w:trPr>
+          <w:cantSplit/>
+        </w:trPr>
         <w:tc>
           <w:tcPr>
             <w:tcW w:w="9638" w:type="dxa"/>
@@ -10032,6 +10473,9 @@
             <w:bottom w:w="0" w:type="dxa"/>
           </w:tblCellMar>
         </w:tblPrEx>
+        <w:trPr>
+          <w:cantSplit/>
+        </w:trPr>
         <w:tc>
           <w:tcPr>
             <w:tcW w:w="9638" w:type="dxa"/>
@@ -10086,7 +10530,7 @@
       <w:pPr>
         <w:pStyle w:val="Titre2"/>
       </w:pPr>
-      <w:bookmarkStart w:id="14" w:name="_Toc240897446"/>
+      <w:bookmarkStart w:id="14" w:name="_Toc240898623"/>
       <w:r>
         <w:t>4.10 Trésorerie et indicateurs financiers</w:t>
       </w:r>
@@ -10098,6 +10542,73 @@
       </w:pPr>
       <w:r>
         <w:t>Ce qui est réellement entré et sorti, compte par compte, et les indicateurs du mois.</w:t>
+      </w:r>
+    </w:p>
+    <w:p>
+      <w:pPr>
+        <w:keepNext/>
+        <w:keepLines/>
+        <w:spacing w:before="120" w:after="60"/>
+        <w:jc w:val="center"/>
+      </w:pPr>
+      <w:r>
+        <w:rPr>
+          <w:noProof/>
+        </w:rPr>
+        <w:drawing>
+          <wp:inline distT="0" distB="0" distL="0" distR="0" wp14:anchorId="4184C3C0" wp14:editId="1D566309">
+            <wp:extent cx="5334000" cy="3333750"/>
+            <wp:effectExtent l="0" t="0" r="0" b="0"/>
+            <wp:docPr id="7" name="tresorerie" descr="Trésorerie : soldes par compte et journal des mouvements." title="Trésorerie : soldes par compte et journal des mouvements."/>
+            <wp:cNvGraphicFramePr>
+              <a:graphicFrameLocks xmlns:a="http://schemas.openxmlformats.org/drawingml/2006/main" noChangeAspect="1"/>
+            </wp:cNvGraphicFramePr>
+            <a:graphic xmlns:a="http://schemas.openxmlformats.org/drawingml/2006/main">
+              <a:graphicData uri="http://schemas.openxmlformats.org/drawingml/2006/picture">
+                <pic:pic xmlns:pic="http://schemas.openxmlformats.org/drawingml/2006/picture">
+                  <pic:nvPicPr>
+                    <pic:cNvPr id="0" name=""/>
+                    <pic:cNvPicPr>
+                      <a:picLocks noChangeAspect="1" noChangeArrowheads="1"/>
+                    </pic:cNvPicPr>
+                  </pic:nvPicPr>
+                  <pic:blipFill>
+                    <a:blip r:embed="rId13"/>
+                    <a:srcRect/>
+                    <a:stretch>
+                      <a:fillRect/>
+                    </a:stretch>
+                  </pic:blipFill>
+                  <pic:spPr bwMode="auto">
+                    <a:xfrm>
+                      <a:off x="0" y="0"/>
+                      <a:ext cx="5334000" cy="3333750"/>
+                    </a:xfrm>
+                    <a:prstGeom prst="rect">
+                      <a:avLst/>
+                    </a:prstGeom>
+                  </pic:spPr>
+                </pic:pic>
+              </a:graphicData>
+            </a:graphic>
+          </wp:inline>
+        </w:drawing>
+      </w:r>
+    </w:p>
+    <w:p>
+      <w:pPr>
+        <w:spacing w:after="200"/>
+        <w:jc w:val="center"/>
+      </w:pPr>
+      <w:r>
+        <w:rPr>
+          <w:i/>
+          <w:iCs/>
+          <w:color w:val="5B5B5B"/>
+          <w:sz w:val="18"/>
+          <w:szCs w:val="18"/>
+        </w:rPr>
+        <w:t>Trésorerie : soldes par compte et journal des mouvements.</w:t>
       </w:r>
     </w:p>
     <w:p>
@@ -10172,6 +10683,7 @@
         <w:pStyle w:val="Titre3"/>
       </w:pPr>
       <w:r>
+        <w:lastRenderedPageBreak/>
         <w:t>Ce que le système fait pour vous</w:t>
       </w:r>
     </w:p>
@@ -10308,6 +10820,9 @@
             <w:bottom w:w="0" w:type="dxa"/>
           </w:tblCellMar>
         </w:tblPrEx>
+        <w:trPr>
+          <w:cantSplit/>
+        </w:trPr>
         <w:tc>
           <w:tcPr>
             <w:tcW w:w="9638" w:type="dxa"/>
@@ -10335,7 +10850,6 @@
                 <w:bCs/>
                 <w:color w:val="8B0319"/>
               </w:rPr>
-              <w:lastRenderedPageBreak/>
               <w:t>Qui y accède</w:t>
             </w:r>
           </w:p>
@@ -10386,6 +10900,9 @@
             <w:bottom w:w="0" w:type="dxa"/>
           </w:tblCellMar>
         </w:tblPrEx>
+        <w:trPr>
+          <w:cantSplit/>
+        </w:trPr>
         <w:tc>
           <w:tcPr>
             <w:tcW w:w="9638" w:type="dxa"/>
@@ -10440,7 +10957,7 @@
       <w:pPr>
         <w:pStyle w:val="Titre2"/>
       </w:pPr>
-      <w:bookmarkStart w:id="15" w:name="_Toc240897447"/>
+      <w:bookmarkStart w:id="15" w:name="_Toc240898624"/>
       <w:r>
         <w:t>4.11 Tableau de bord et notifications</w:t>
       </w:r>
@@ -10688,6 +11205,9 @@
             <w:bottom w:w="0" w:type="dxa"/>
           </w:tblCellMar>
         </w:tblPrEx>
+        <w:trPr>
+          <w:cantSplit/>
+        </w:trPr>
         <w:tc>
           <w:tcPr>
             <w:tcW w:w="9638" w:type="dxa"/>
@@ -10715,6 +11235,7 @@
                 <w:bCs/>
                 <w:color w:val="F28A14"/>
               </w:rPr>
+              <w:lastRenderedPageBreak/>
               <w:t>Pas encore disponible</w:t>
             </w:r>
           </w:p>
@@ -10742,7 +11263,7 @@
       <w:pPr>
         <w:pStyle w:val="Titre2"/>
       </w:pPr>
-      <w:bookmarkStart w:id="16" w:name="_Toc240897448"/>
+      <w:bookmarkStart w:id="16" w:name="_Toc240898625"/>
       <w:r>
         <w:t>4.12 Espace chauffeur sur téléphone</w:t>
       </w:r>
@@ -10755,6 +11276,273 @@
       <w:r>
         <w:t>Une application web pensée pour les gros doigts et le plein soleil : de grands boutons, peu de texte, installable sur l’écran d’accueil du téléphone comme une application.</w:t>
       </w:r>
+    </w:p>
+    <w:tbl>
+      <w:tblPr>
+        <w:tblW w:w="9636" w:type="dxa"/>
+        <w:tblBorders>
+          <w:top w:val="single" w:sz="4" w:space="0" w:color="auto"/>
+          <w:left w:val="single" w:sz="4" w:space="0" w:color="auto"/>
+          <w:bottom w:val="single" w:sz="4" w:space="0" w:color="auto"/>
+          <w:right w:val="single" w:sz="4" w:space="0" w:color="auto"/>
+          <w:insideH w:val="single" w:sz="4" w:space="0" w:color="auto"/>
+          <w:insideV w:val="single" w:sz="4" w:space="0" w:color="auto"/>
+        </w:tblBorders>
+        <w:tblCellMar>
+          <w:left w:w="10" w:type="dxa"/>
+          <w:right w:w="10" w:type="dxa"/>
+        </w:tblCellMar>
+        <w:tblLook w:val="0000" w:firstRow="0" w:lastRow="0" w:firstColumn="0" w:lastColumn="0" w:noHBand="0" w:noVBand="0"/>
+      </w:tblPr>
+      <w:tblGrid>
+        <w:gridCol w:w="3212"/>
+        <w:gridCol w:w="3212"/>
+        <w:gridCol w:w="3212"/>
+      </w:tblGrid>
+      <w:tr>
+        <w:tblPrEx>
+          <w:tblCellMar>
+            <w:top w:w="0" w:type="dxa"/>
+            <w:bottom w:w="0" w:type="dxa"/>
+          </w:tblCellMar>
+        </w:tblPrEx>
+        <w:trPr>
+          <w:cantSplit/>
+        </w:trPr>
+        <w:tc>
+          <w:tcPr>
+            <w:tcW w:w="3212" w:type="dxa"/>
+            <w:tcBorders>
+              <w:top w:val="none" w:sz="0" w:space="0" w:color="FFFFFF"/>
+              <w:left w:val="none" w:sz="0" w:space="0" w:color="FFFFFF"/>
+              <w:bottom w:val="none" w:sz="0" w:space="0" w:color="FFFFFF"/>
+              <w:right w:val="none" w:sz="0" w:space="0" w:color="FFFFFF"/>
+            </w:tcBorders>
+          </w:tcPr>
+          <w:p>
+            <w:pPr>
+              <w:spacing w:after="60"/>
+              <w:jc w:val="center"/>
+            </w:pPr>
+            <w:r>
+              <w:rPr>
+                <w:noProof/>
+              </w:rPr>
+              <w:drawing>
+                <wp:inline distT="0" distB="0" distL="0" distR="0" wp14:anchorId="16221249" wp14:editId="34242EF8">
+                  <wp:extent cx="1847850" cy="4000500"/>
+                  <wp:effectExtent l="0" t="0" r="0" b="0"/>
+                  <wp:docPr id="8" name="mobile_accueil" descr="Accueil du chauffeur" title="Accueil du chauffeur"/>
+                  <wp:cNvGraphicFramePr>
+                    <a:graphicFrameLocks xmlns:a="http://schemas.openxmlformats.org/drawingml/2006/main" noChangeAspect="1"/>
+                  </wp:cNvGraphicFramePr>
+                  <a:graphic xmlns:a="http://schemas.openxmlformats.org/drawingml/2006/main">
+                    <a:graphicData uri="http://schemas.openxmlformats.org/drawingml/2006/picture">
+                      <pic:pic xmlns:pic="http://schemas.openxmlformats.org/drawingml/2006/picture">
+                        <pic:nvPicPr>
+                          <pic:cNvPr id="0" name=""/>
+                          <pic:cNvPicPr>
+                            <a:picLocks noChangeAspect="1" noChangeArrowheads="1"/>
+                          </pic:cNvPicPr>
+                        </pic:nvPicPr>
+                        <pic:blipFill>
+                          <a:blip r:embed="rId14"/>
+                          <a:srcRect/>
+                          <a:stretch>
+                            <a:fillRect/>
+                          </a:stretch>
+                        </pic:blipFill>
+                        <pic:spPr bwMode="auto">
+                          <a:xfrm>
+                            <a:off x="0" y="0"/>
+                            <a:ext cx="1847850" cy="4000500"/>
+                          </a:xfrm>
+                          <a:prstGeom prst="rect">
+                            <a:avLst/>
+                          </a:prstGeom>
+                        </pic:spPr>
+                      </pic:pic>
+                    </a:graphicData>
+                  </a:graphic>
+                </wp:inline>
+              </w:drawing>
+            </w:r>
+          </w:p>
+          <w:p>
+            <w:pPr>
+              <w:spacing w:after="160"/>
+              <w:jc w:val="center"/>
+            </w:pPr>
+            <w:r>
+              <w:rPr>
+                <w:i/>
+                <w:iCs/>
+                <w:color w:val="5B5B5B"/>
+                <w:sz w:val="18"/>
+                <w:szCs w:val="18"/>
+              </w:rPr>
+              <w:t>Accueil du chauffeur</w:t>
+            </w:r>
+          </w:p>
+        </w:tc>
+        <w:tc>
+          <w:tcPr>
+            <w:tcW w:w="3212" w:type="dxa"/>
+            <w:tcBorders>
+              <w:top w:val="none" w:sz="0" w:space="0" w:color="FFFFFF"/>
+              <w:left w:val="none" w:sz="0" w:space="0" w:color="FFFFFF"/>
+              <w:bottom w:val="none" w:sz="0" w:space="0" w:color="FFFFFF"/>
+              <w:right w:val="none" w:sz="0" w:space="0" w:color="FFFFFF"/>
+            </w:tcBorders>
+          </w:tcPr>
+          <w:p>
+            <w:pPr>
+              <w:spacing w:after="60"/>
+              <w:jc w:val="center"/>
+            </w:pPr>
+            <w:r>
+              <w:rPr>
+                <w:noProof/>
+              </w:rPr>
+              <w:drawing>
+                <wp:inline distT="0" distB="0" distL="0" distR="0" wp14:anchorId="6B2ABFA0" wp14:editId="62064DAA">
+                  <wp:extent cx="1847850" cy="4000500"/>
+                  <wp:effectExtent l="0" t="0" r="0" b="0"/>
+                  <wp:docPr id="9" name="mobile_mission" descr="Une mission, prête à démarrer" title="Une mission, prête à démarrer"/>
+                  <wp:cNvGraphicFramePr>
+                    <a:graphicFrameLocks xmlns:a="http://schemas.openxmlformats.org/drawingml/2006/main" noChangeAspect="1"/>
+                  </wp:cNvGraphicFramePr>
+                  <a:graphic xmlns:a="http://schemas.openxmlformats.org/drawingml/2006/main">
+                    <a:graphicData uri="http://schemas.openxmlformats.org/drawingml/2006/picture">
+                      <pic:pic xmlns:pic="http://schemas.openxmlformats.org/drawingml/2006/picture">
+                        <pic:nvPicPr>
+                          <pic:cNvPr id="0" name=""/>
+                          <pic:cNvPicPr>
+                            <a:picLocks noChangeAspect="1" noChangeArrowheads="1"/>
+                          </pic:cNvPicPr>
+                        </pic:nvPicPr>
+                        <pic:blipFill>
+                          <a:blip r:embed="rId15"/>
+                          <a:srcRect/>
+                          <a:stretch>
+                            <a:fillRect/>
+                          </a:stretch>
+                        </pic:blipFill>
+                        <pic:spPr bwMode="auto">
+                          <a:xfrm>
+                            <a:off x="0" y="0"/>
+                            <a:ext cx="1847850" cy="4000500"/>
+                          </a:xfrm>
+                          <a:prstGeom prst="rect">
+                            <a:avLst/>
+                          </a:prstGeom>
+                        </pic:spPr>
+                      </pic:pic>
+                    </a:graphicData>
+                  </a:graphic>
+                </wp:inline>
+              </w:drawing>
+            </w:r>
+          </w:p>
+          <w:p>
+            <w:pPr>
+              <w:spacing w:after="160"/>
+              <w:jc w:val="center"/>
+            </w:pPr>
+            <w:r>
+              <w:rPr>
+                <w:i/>
+                <w:iCs/>
+                <w:color w:val="5B5B5B"/>
+                <w:sz w:val="18"/>
+                <w:szCs w:val="18"/>
+              </w:rPr>
+              <w:t>Une mission, prête à démarrer</w:t>
+            </w:r>
+          </w:p>
+        </w:tc>
+        <w:tc>
+          <w:tcPr>
+            <w:tcW w:w="3212" w:type="dxa"/>
+            <w:tcBorders>
+              <w:top w:val="none" w:sz="0" w:space="0" w:color="FFFFFF"/>
+              <w:left w:val="none" w:sz="0" w:space="0" w:color="FFFFFF"/>
+              <w:bottom w:val="none" w:sz="0" w:space="0" w:color="FFFFFF"/>
+              <w:right w:val="none" w:sz="0" w:space="0" w:color="FFFFFF"/>
+            </w:tcBorders>
+          </w:tcPr>
+          <w:p>
+            <w:pPr>
+              <w:spacing w:after="60"/>
+              <w:jc w:val="center"/>
+            </w:pPr>
+            <w:r>
+              <w:rPr>
+                <w:noProof/>
+              </w:rPr>
+              <w:drawing>
+                <wp:inline distT="0" distB="0" distL="0" distR="0" wp14:anchorId="26DE6C5E" wp14:editId="3DF0246C">
+                  <wp:extent cx="1847850" cy="4000500"/>
+                  <wp:effectExtent l="0" t="0" r="0" b="0"/>
+                  <wp:docPr id="10" name="mobile_checklist" descr="Check-list du camion" title="Check-list du camion"/>
+                  <wp:cNvGraphicFramePr>
+                    <a:graphicFrameLocks xmlns:a="http://schemas.openxmlformats.org/drawingml/2006/main" noChangeAspect="1"/>
+                  </wp:cNvGraphicFramePr>
+                  <a:graphic xmlns:a="http://schemas.openxmlformats.org/drawingml/2006/main">
+                    <a:graphicData uri="http://schemas.openxmlformats.org/drawingml/2006/picture">
+                      <pic:pic xmlns:pic="http://schemas.openxmlformats.org/drawingml/2006/picture">
+                        <pic:nvPicPr>
+                          <pic:cNvPr id="0" name=""/>
+                          <pic:cNvPicPr>
+                            <a:picLocks noChangeAspect="1" noChangeArrowheads="1"/>
+                          </pic:cNvPicPr>
+                        </pic:nvPicPr>
+                        <pic:blipFill>
+                          <a:blip r:embed="rId16"/>
+                          <a:srcRect/>
+                          <a:stretch>
+                            <a:fillRect/>
+                          </a:stretch>
+                        </pic:blipFill>
+                        <pic:spPr bwMode="auto">
+                          <a:xfrm>
+                            <a:off x="0" y="0"/>
+                            <a:ext cx="1847850" cy="4000500"/>
+                          </a:xfrm>
+                          <a:prstGeom prst="rect">
+                            <a:avLst/>
+                          </a:prstGeom>
+                        </pic:spPr>
+                      </pic:pic>
+                    </a:graphicData>
+                  </a:graphic>
+                </wp:inline>
+              </w:drawing>
+            </w:r>
+          </w:p>
+          <w:p>
+            <w:pPr>
+              <w:spacing w:after="160"/>
+              <w:jc w:val="center"/>
+            </w:pPr>
+            <w:r>
+              <w:rPr>
+                <w:i/>
+                <w:iCs/>
+                <w:color w:val="5B5B5B"/>
+                <w:sz w:val="18"/>
+                <w:szCs w:val="18"/>
+              </w:rPr>
+              <w:t>Check-list du camion</w:t>
+            </w:r>
+          </w:p>
+        </w:tc>
+      </w:tr>
+    </w:tbl>
+    <w:p>
+      <w:pPr>
+        <w:spacing w:after="60"/>
+      </w:pPr>
     </w:p>
     <w:p>
       <w:pPr>
@@ -10798,7 +11586,6 @@
           <w:b/>
           <w:bCs/>
         </w:rPr>
-        <w:lastRenderedPageBreak/>
         <w:t>Voir ses missions</w:t>
       </w:r>
       <w:r>
@@ -10959,6 +11746,7 @@
         <w:spacing w:after="60" w:line="276" w:lineRule="auto"/>
       </w:pPr>
       <w:r>
+        <w:lastRenderedPageBreak/>
         <w:t xml:space="preserve">Il ne voit </w:t>
       </w:r>
       <w:r>
@@ -11071,6 +11859,9 @@
             <w:bottom w:w="0" w:type="dxa"/>
           </w:tblCellMar>
         </w:tblPrEx>
+        <w:trPr>
+          <w:cantSplit/>
+        </w:trPr>
         <w:tc>
           <w:tcPr>
             <w:tcW w:w="9638" w:type="dxa"/>
@@ -11148,6 +11939,9 @@
             <w:bottom w:w="0" w:type="dxa"/>
           </w:tblCellMar>
         </w:tblPrEx>
+        <w:trPr>
+          <w:cantSplit/>
+        </w:trPr>
         <w:tc>
           <w:tcPr>
             <w:tcW w:w="9638" w:type="dxa"/>
@@ -11202,7 +11996,7 @@
       <w:pPr>
         <w:pStyle w:val="Titre2"/>
       </w:pPr>
-      <w:bookmarkStart w:id="17" w:name="_Toc240897449"/>
+      <w:bookmarkStart w:id="17" w:name="_Toc240898626"/>
       <w:r>
         <w:t>4.13 Sécurité, traçabilité et API</w:t>
       </w:r>
@@ -11341,7 +12135,6 @@
         <w:spacing w:after="60" w:line="276" w:lineRule="auto"/>
       </w:pPr>
       <w:r>
-        <w:lastRenderedPageBreak/>
         <w:t xml:space="preserve">Les codes secrets des missions n’apparaissent </w:t>
       </w:r>
       <w:r>
@@ -11387,6 +12180,9 @@
             <w:bottom w:w="0" w:type="dxa"/>
           </w:tblCellMar>
         </w:tblPrEx>
+        <w:trPr>
+          <w:cantSplit/>
+        </w:trPr>
         <w:tc>
           <w:tcPr>
             <w:tcW w:w="9638" w:type="dxa"/>
@@ -11446,7 +12242,7 @@
       <w:pPr>
         <w:pStyle w:val="Titre1"/>
       </w:pPr>
-      <w:bookmarkStart w:id="18" w:name="_Toc240897450"/>
+      <w:bookmarkStart w:id="18" w:name="_Toc240898627"/>
       <w:r>
         <w:lastRenderedPageBreak/>
         <w:t>5. Un exemple complet : une mission, de la demande à l’encaissement</w:t>
@@ -12622,7 +13418,7 @@
       <w:pPr>
         <w:pStyle w:val="Titre1"/>
       </w:pPr>
-      <w:bookmarkStart w:id="19" w:name="_Toc240897451"/>
+      <w:bookmarkStart w:id="19" w:name="_Toc240898628"/>
       <w:r>
         <w:lastRenderedPageBreak/>
         <w:t>6. Ce qui n’est pas encore fait</w:t>
@@ -12661,7 +13457,7 @@
       <w:pPr>
         <w:pStyle w:val="Titre2"/>
       </w:pPr>
-      <w:bookmarkStart w:id="20" w:name="_Toc240897452"/>
+      <w:bookmarkStart w:id="20" w:name="_Toc240898629"/>
       <w:r>
         <w:t>6.1 Décisions prises avec vous</w:t>
       </w:r>
@@ -13226,7 +14022,7 @@
       <w:pPr>
         <w:pStyle w:val="Titre2"/>
       </w:pPr>
-      <w:bookmarkStart w:id="21" w:name="_Toc240897453"/>
+      <w:bookmarkStart w:id="21" w:name="_Toc240898630"/>
       <w:r>
         <w:t>6.2 Prévu avant la mise en service</w:t>
       </w:r>
@@ -13361,7 +14157,7 @@
       <w:pPr>
         <w:pStyle w:val="Titre2"/>
       </w:pPr>
-      <w:bookmarkStart w:id="22" w:name="_Toc240897454"/>
+      <w:bookmarkStart w:id="22" w:name="_Toc240898631"/>
       <w:r>
         <w:t>6.3 Améliorations possibles ensuite</w:t>
       </w:r>
@@ -13478,6 +14274,9 @@
             <w:bottom w:w="0" w:type="dxa"/>
           </w:tblCellMar>
         </w:tblPrEx>
+        <w:trPr>
+          <w:cantSplit/>
+        </w:trPr>
         <w:tc>
           <w:tcPr>
             <w:tcW w:w="9638" w:type="dxa"/>
@@ -13548,7 +14347,7 @@
       <w:pPr>
         <w:pStyle w:val="Titre1"/>
       </w:pPr>
-      <w:bookmarkStart w:id="23" w:name="_Toc240897455"/>
+      <w:bookmarkStart w:id="23" w:name="_Toc240898632"/>
       <w:r>
         <w:t>7. Points à valider avec vous</w:t>
       </w:r>
@@ -14542,10 +15341,10 @@
       </w:r>
     </w:p>
     <w:sectPr>
-      <w:headerReference w:type="default" r:id="rId7"/>
-      <w:footerReference w:type="default" r:id="rId8"/>
-      <w:headerReference w:type="first" r:id="rId9"/>
-      <w:footerReference w:type="first" r:id="rId10"/>
+      <w:headerReference w:type="default" r:id="rId17"/>
+      <w:footerReference w:type="default" r:id="rId18"/>
+      <w:headerReference w:type="first" r:id="rId19"/>
+      <w:footerReference w:type="first" r:id="rId20"/>
       <w:pgSz w:w="11906" w:h="16838"/>
       <w:pgMar w:top="1300" w:right="1134" w:bottom="1200" w:left="1134" w:header="708" w:footer="708" w:gutter="0"/>
       <w:cols w:space="720"/>
@@ -14702,10 +15501,10 @@
 <file path=word/numbering.xml><?xml version="1.0" encoding="utf-8"?>
 <w:numbering xmlns:wpc="http://schemas.microsoft.com/office/word/2010/wordprocessingCanvas" xmlns:cx="http://schemas.microsoft.com/office/drawing/2014/chartex" xmlns:cx1="http://schemas.microsoft.com/office/drawing/2015/9/8/chartex" xmlns:cx2="http://schemas.microsoft.com/office/drawing/2015/10/21/chartex" xmlns:cx3="http://schemas.microsoft.com/office/drawing/2016/5/9/chartex" xmlns:cx4="http://schemas.microsoft.com/office/drawing/2016/5/10/chartex" xmlns:cx5="http://schemas.microsoft.com/office/drawing/2016/5/11/chartex" xmlns:cx6="http://schemas.microsoft.com/office/drawing/2016/5/12/chartex" xmlns:cx7="http://schemas.microsoft.com/office/drawing/2016/5/13/chartex" xmlns:cx8="http://schemas.microsoft.com/office/drawing/2016/5/14/chartex" xmlns:mc="http://schemas.openxmlformats.org/markup-compatibility/2006" xmlns:aink="http://schemas.microsoft.com/office/drawing/2016/ink" xmlns:am3d="http://schemas.microsoft.com/office/drawing/2017/model3d" xmlns:o="urn:schemas-microsoft-com:office:office" xmlns:oel="http://schemas.microsoft.com/office/2019/extlst" xmlns:r="http://schemas.openxmlformats.org/officeDocument/2006/relationships" xmlns:m="http://schemas.openxmlformats.org/officeDocument/2006/math" xmlns:v="urn:schemas-microsoft-com:vml" xmlns:wp14="http://schemas.microsoft.com/office/word/2010/wordprocessingDrawing" xmlns:wp="http://schemas.openxmlformats.org/drawingml/2006/wordprocessingDrawing" xmlns:w10="urn:schemas-microsoft-com:office:word" xmlns:w="http://schemas.openxmlformats.org/wordprocessingml/2006/main" xmlns:w14="http://schemas.microsoft.com/office/word/2010/wordml" xmlns:w15="http://schemas.microsoft.com/office/word/2012/wordml" xmlns:w16cex="http://schemas.microsoft.com/office/word/2018/wordml/cex" xmlns:w16cid="http://schemas.microsoft.com/office/word/2016/wordml/cid" xmlns:w16="http://schemas.microsoft.com/office/word/2018/wordml" xmlns:w16sdtdh="http://schemas.microsoft.com/office/word/2020/wordml/sdtdatahash" xmlns:w16se="http://schemas.microsoft.com/office/word/2015/wordml/symex" xmlns:wpg="http://schemas.microsoft.com/office/word/2010/wordprocessingGroup" xmlns:wpi="http://schemas.microsoft.com/office/word/2010/wordprocessingInk" xmlns:wne="http://schemas.microsoft.com/office/word/2006/wordml" xmlns:wps="http://schemas.microsoft.com/office/word/2010/wordprocessingShape" mc:Ignorable="w14 w15 w16se w16cid w16 w16cex w16sdtdh wp14">
   <w:abstractNum w:abstractNumId="0" w15:restartNumberingAfterBreak="0">
-    <w:nsid w:val="19731831"/>
+    <w:nsid w:val="18F82995"/>
     <w:multiLevelType w:val="hybridMultilevel"/>
-    <w:tmpl w:val="A5B81E5E"/>
-    <w:lvl w:ilvl="0" w:tplc="55843F00">
+    <w:tmpl w:val="E7EE190C"/>
+    <w:lvl w:ilvl="0" w:tplc="566E51E0">
       <w:start w:val="1"/>
       <w:numFmt w:val="bullet"/>
       <w:lvlText w:val="•"/>
@@ -14717,7 +15516,7 @@
         <w:color w:val="F28A14"/>
       </w:rPr>
     </w:lvl>
-    <w:lvl w:ilvl="1" w:tplc="575E0510">
+    <w:lvl w:ilvl="1" w:tplc="78C48C72">
       <w:start w:val="1"/>
       <w:numFmt w:val="bullet"/>
       <w:lvlText w:val="–"/>
@@ -14726,47 +15525,47 @@
         <w:ind w:left="1000" w:hanging="270"/>
       </w:pPr>
     </w:lvl>
-    <w:lvl w:ilvl="2" w:tplc="BA5AAC2E">
+    <w:lvl w:ilvl="2" w:tplc="8B0EFA80">
       <w:numFmt w:val="decimal"/>
       <w:lvlText w:val=""/>
       <w:lvlJc w:val="left"/>
     </w:lvl>
-    <w:lvl w:ilvl="3" w:tplc="F48644FA">
+    <w:lvl w:ilvl="3" w:tplc="936623E6">
       <w:numFmt w:val="decimal"/>
       <w:lvlText w:val=""/>
       <w:lvlJc w:val="left"/>
     </w:lvl>
-    <w:lvl w:ilvl="4" w:tplc="994EC36C">
+    <w:lvl w:ilvl="4" w:tplc="B92E966C">
       <w:numFmt w:val="decimal"/>
       <w:lvlText w:val=""/>
       <w:lvlJc w:val="left"/>
     </w:lvl>
-    <w:lvl w:ilvl="5" w:tplc="AE465164">
+    <w:lvl w:ilvl="5" w:tplc="2502476E">
       <w:numFmt w:val="decimal"/>
       <w:lvlText w:val=""/>
       <w:lvlJc w:val="left"/>
     </w:lvl>
-    <w:lvl w:ilvl="6" w:tplc="F4A2A28C">
+    <w:lvl w:ilvl="6" w:tplc="D48ECFD6">
       <w:numFmt w:val="decimal"/>
       <w:lvlText w:val=""/>
       <w:lvlJc w:val="left"/>
     </w:lvl>
-    <w:lvl w:ilvl="7" w:tplc="7D76B5B6">
+    <w:lvl w:ilvl="7" w:tplc="DF3461E4">
       <w:numFmt w:val="decimal"/>
       <w:lvlText w:val=""/>
       <w:lvlJc w:val="left"/>
     </w:lvl>
-    <w:lvl w:ilvl="8" w:tplc="90F8F252">
+    <w:lvl w:ilvl="8" w:tplc="E9DACCAE">
       <w:numFmt w:val="decimal"/>
       <w:lvlText w:val=""/>
       <w:lvlJc w:val="left"/>
     </w:lvl>
   </w:abstractNum>
   <w:abstractNum w:abstractNumId="1" w15:restartNumberingAfterBreak="0">
-    <w:nsid w:val="53540A95"/>
+    <w:nsid w:val="28D83031"/>
     <w:multiLevelType w:val="hybridMultilevel"/>
-    <w:tmpl w:val="6FA68E3C"/>
-    <w:lvl w:ilvl="0" w:tplc="345ADA02">
+    <w:tmpl w:val="203E2AEA"/>
+    <w:lvl w:ilvl="0" w:tplc="98321D2E">
       <w:start w:val="1"/>
       <w:numFmt w:val="bullet"/>
       <w:lvlText w:val="●"/>
@@ -14775,7 +15574,7 @@
         <w:ind w:left="720" w:hanging="360"/>
       </w:pPr>
     </w:lvl>
-    <w:lvl w:ilvl="1" w:tplc="199CC73C">
+    <w:lvl w:ilvl="1" w:tplc="DC9E260E">
       <w:start w:val="1"/>
       <w:numFmt w:val="bullet"/>
       <w:lvlText w:val="○"/>
@@ -14784,7 +15583,7 @@
         <w:ind w:left="1440" w:hanging="360"/>
       </w:pPr>
     </w:lvl>
-    <w:lvl w:ilvl="2" w:tplc="CDF2631A">
+    <w:lvl w:ilvl="2" w:tplc="5CC444E0">
       <w:start w:val="1"/>
       <w:numFmt w:val="bullet"/>
       <w:lvlText w:val="■"/>
@@ -14793,7 +15592,7 @@
         <w:ind w:left="2160" w:hanging="360"/>
       </w:pPr>
     </w:lvl>
-    <w:lvl w:ilvl="3" w:tplc="40405886">
+    <w:lvl w:ilvl="3" w:tplc="9D74E1AE">
       <w:start w:val="1"/>
       <w:numFmt w:val="bullet"/>
       <w:lvlText w:val="●"/>
@@ -14802,7 +15601,7 @@
         <w:ind w:left="2880" w:hanging="360"/>
       </w:pPr>
     </w:lvl>
-    <w:lvl w:ilvl="4" w:tplc="7A56AB7C">
+    <w:lvl w:ilvl="4" w:tplc="579A16E6">
       <w:start w:val="1"/>
       <w:numFmt w:val="bullet"/>
       <w:lvlText w:val="○"/>
@@ -14811,7 +15610,7 @@
         <w:ind w:left="3600" w:hanging="360"/>
       </w:pPr>
     </w:lvl>
-    <w:lvl w:ilvl="5" w:tplc="49720DB2">
+    <w:lvl w:ilvl="5" w:tplc="D2CEDDFA">
       <w:start w:val="1"/>
       <w:numFmt w:val="bullet"/>
       <w:lvlText w:val="■"/>
@@ -14820,7 +15619,7 @@
         <w:ind w:left="4320" w:hanging="360"/>
       </w:pPr>
     </w:lvl>
-    <w:lvl w:ilvl="6" w:tplc="E264ACAE">
+    <w:lvl w:ilvl="6" w:tplc="3C4EF526">
       <w:start w:val="1"/>
       <w:numFmt w:val="bullet"/>
       <w:lvlText w:val="●"/>
@@ -14829,7 +15628,7 @@
         <w:ind w:left="5040" w:hanging="360"/>
       </w:pPr>
     </w:lvl>
-    <w:lvl w:ilvl="7" w:tplc="3E221830">
+    <w:lvl w:ilvl="7" w:tplc="5B9E2CAC">
       <w:start w:val="1"/>
       <w:numFmt w:val="bullet"/>
       <w:lvlText w:val="●"/>
@@ -14838,7 +15637,7 @@
         <w:ind w:left="5760" w:hanging="360"/>
       </w:pPr>
     </w:lvl>
-    <w:lvl w:ilvl="8" w:tplc="3834A9D0">
+    <w:lvl w:ilvl="8" w:tplc="5016AF80">
       <w:start w:val="1"/>
       <w:numFmt w:val="bullet"/>
       <w:lvlText w:val="●"/>
@@ -14848,13 +15647,13 @@
       </w:pPr>
     </w:lvl>
   </w:abstractNum>
-  <w:num w:numId="1" w16cid:durableId="1744519923">
+  <w:num w:numId="1" w16cid:durableId="1041201487">
     <w:abstractNumId w:val="1"/>
     <w:lvlOverride w:ilvl="0">
       <w:startOverride w:val="1"/>
     </w:lvlOverride>
   </w:num>
-  <w:num w:numId="2" w16cid:durableId="1340893234">
+  <w:num w:numId="2" w16cid:durableId="609967419">
     <w:abstractNumId w:val="0"/>
     <w:lvlOverride w:ilvl="0">
       <w:startOverride w:val="1"/>
@@ -15481,7 +16280,7 @@
     <w:autoRedefine/>
     <w:uiPriority w:val="39"/>
     <w:unhideWhenUsed/>
-    <w:rsid w:val="006D45A1"/>
+    <w:rsid w:val="00E626E8"/>
     <w:pPr>
       <w:spacing w:after="100"/>
     </w:pPr>
@@ -15493,7 +16292,7 @@
     <w:autoRedefine/>
     <w:uiPriority w:val="39"/>
     <w:unhideWhenUsed/>
-    <w:rsid w:val="006D45A1"/>
+    <w:rsid w:val="00E626E8"/>
     <w:pPr>
       <w:spacing w:after="100"/>
       <w:ind w:left="220"/>

</xml_diff>

<commit_message>
docs: corriger l'accès de la Direction au journal d'audit dans les présentations
Vérifié par test : la Direction ne lit le journal (espace d'administration)
que si son compte a l'accès équipe (is_staff), non activé par défaut. Le
tableau des droits, la page Direction et la partie Sécurité du Word, ainsi
que la diapositive des droits du PowerPoint, le précisent maintenant.

Co-Authored-By: Claude Sonnet 5 <noreply@anthropic.com>
</commit_message>
<xml_diff>
--- a/Presentation-ERP-DEN-Source.docx
+++ b/Presentation-ERP-DEN-Source.docx
@@ -107,7 +107,7 @@
     <w:sdt>
       <w:sdtPr>
         <w:alias w:val="Sommaire"/>
-        <w:id w:val="-999340197"/>
+        <w:id w:val="-387583066"/>
       </w:sdtPr>
       <w:sdtEndPr/>
       <w:sdtContent>
@@ -135,7 +135,7 @@
           <w:r>
             <w:fldChar w:fldCharType="separate"/>
           </w:r>
-          <w:hyperlink w:anchor="_Toc240902348" w:history="1">
+          <w:hyperlink w:anchor="_Toc240904035" w:history="1">
             <w:r>
               <w:rPr>
                 <w:rStyle w:val="Lienhypertexte"/>
@@ -159,7 +159,7 @@
               <w:rPr>
                 <w:noProof/>
               </w:rPr>
-              <w:instrText xml:space="preserve"> PAGEREF _Toc240902348 \h </w:instrText>
+              <w:instrText xml:space="preserve"> PAGEREF _Toc240904035 \h </w:instrText>
             </w:r>
             <w:r>
               <w:rPr>
@@ -201,7 +201,7 @@
               <w14:ligatures w14:val="standardContextual"/>
             </w:rPr>
           </w:pPr>
-          <w:hyperlink w:anchor="_Toc240902349" w:history="1">
+          <w:hyperlink w:anchor="_Toc240904036" w:history="1">
             <w:r>
               <w:rPr>
                 <w:rStyle w:val="Lienhypertexte"/>
@@ -225,7 +225,7 @@
               <w:rPr>
                 <w:noProof/>
               </w:rPr>
-              <w:instrText xml:space="preserve"> PAGEREF _Toc240902349 \h </w:instrText>
+              <w:instrText xml:space="preserve"> PAGEREF _Toc240904036 \h </w:instrText>
             </w:r>
             <w:r>
               <w:rPr>
@@ -267,7 +267,7 @@
               <w14:ligatures w14:val="standardContextual"/>
             </w:rPr>
           </w:pPr>
-          <w:hyperlink w:anchor="_Toc240902350" w:history="1">
+          <w:hyperlink w:anchor="_Toc240904037" w:history="1">
             <w:r>
               <w:rPr>
                 <w:rStyle w:val="Lienhypertexte"/>
@@ -291,7 +291,7 @@
               <w:rPr>
                 <w:noProof/>
               </w:rPr>
-              <w:instrText xml:space="preserve"> PAGEREF _Toc240902350 \h </w:instrText>
+              <w:instrText xml:space="preserve"> PAGEREF _Toc240904037 \h </w:instrText>
             </w:r>
             <w:r>
               <w:rPr>
@@ -333,7 +333,7 @@
               <w14:ligatures w14:val="standardContextual"/>
             </w:rPr>
           </w:pPr>
-          <w:hyperlink w:anchor="_Toc240902351" w:history="1">
+          <w:hyperlink w:anchor="_Toc240904038" w:history="1">
             <w:r>
               <w:rPr>
                 <w:rStyle w:val="Lienhypertexte"/>
@@ -357,7 +357,7 @@
               <w:rPr>
                 <w:noProof/>
               </w:rPr>
-              <w:instrText xml:space="preserve"> PAGEREF _Toc240902351 \h </w:instrText>
+              <w:instrText xml:space="preserve"> PAGEREF _Toc240904038 \h </w:instrText>
             </w:r>
             <w:r>
               <w:rPr>
@@ -399,7 +399,7 @@
               <w14:ligatures w14:val="standardContextual"/>
             </w:rPr>
           </w:pPr>
-          <w:hyperlink w:anchor="_Toc240902352" w:history="1">
+          <w:hyperlink w:anchor="_Toc240904039" w:history="1">
             <w:r>
               <w:rPr>
                 <w:rStyle w:val="Lienhypertexte"/>
@@ -423,7 +423,7 @@
               <w:rPr>
                 <w:noProof/>
               </w:rPr>
-              <w:instrText xml:space="preserve"> PAGEREF _Toc240902352 \h </w:instrText>
+              <w:instrText xml:space="preserve"> PAGEREF _Toc240904039 \h </w:instrText>
             </w:r>
             <w:r>
               <w:rPr>
@@ -465,7 +465,7 @@
               <w14:ligatures w14:val="standardContextual"/>
             </w:rPr>
           </w:pPr>
-          <w:hyperlink w:anchor="_Toc240902353" w:history="1">
+          <w:hyperlink w:anchor="_Toc240904040" w:history="1">
             <w:r>
               <w:rPr>
                 <w:rStyle w:val="Lienhypertexte"/>
@@ -489,7 +489,7 @@
               <w:rPr>
                 <w:noProof/>
               </w:rPr>
-              <w:instrText xml:space="preserve"> PAGEREF _Toc240902353 \h </w:instrText>
+              <w:instrText xml:space="preserve"> PAGEREF _Toc240904040 \h </w:instrText>
             </w:r>
             <w:r>
               <w:rPr>
@@ -531,7 +531,7 @@
               <w14:ligatures w14:val="standardContextual"/>
             </w:rPr>
           </w:pPr>
-          <w:hyperlink w:anchor="_Toc240902354" w:history="1">
+          <w:hyperlink w:anchor="_Toc240904041" w:history="1">
             <w:r>
               <w:rPr>
                 <w:rStyle w:val="Lienhypertexte"/>
@@ -555,7 +555,7 @@
               <w:rPr>
                 <w:noProof/>
               </w:rPr>
-              <w:instrText xml:space="preserve"> PAGEREF _Toc240902354 \h </w:instrText>
+              <w:instrText xml:space="preserve"> PAGEREF _Toc240904041 \h </w:instrText>
             </w:r>
             <w:r>
               <w:rPr>
@@ -597,7 +597,7 @@
               <w14:ligatures w14:val="standardContextual"/>
             </w:rPr>
           </w:pPr>
-          <w:hyperlink w:anchor="_Toc240902355" w:history="1">
+          <w:hyperlink w:anchor="_Toc240904042" w:history="1">
             <w:r>
               <w:rPr>
                 <w:rStyle w:val="Lienhypertexte"/>
@@ -621,7 +621,7 @@
               <w:rPr>
                 <w:noProof/>
               </w:rPr>
-              <w:instrText xml:space="preserve"> PAGEREF _Toc240902355 \h </w:instrText>
+              <w:instrText xml:space="preserve"> PAGEREF _Toc240904042 \h </w:instrText>
             </w:r>
             <w:r>
               <w:rPr>
@@ -663,7 +663,7 @@
               <w14:ligatures w14:val="standardContextual"/>
             </w:rPr>
           </w:pPr>
-          <w:hyperlink w:anchor="_Toc240902356" w:history="1">
+          <w:hyperlink w:anchor="_Toc240904043" w:history="1">
             <w:r>
               <w:rPr>
                 <w:rStyle w:val="Lienhypertexte"/>
@@ -687,7 +687,7 @@
               <w:rPr>
                 <w:noProof/>
               </w:rPr>
-              <w:instrText xml:space="preserve"> PAGEREF _Toc240902356 \h </w:instrText>
+              <w:instrText xml:space="preserve"> PAGEREF _Toc240904043 \h </w:instrText>
             </w:r>
             <w:r>
               <w:rPr>
@@ -729,7 +729,7 @@
               <w14:ligatures w14:val="standardContextual"/>
             </w:rPr>
           </w:pPr>
-          <w:hyperlink w:anchor="_Toc240902357" w:history="1">
+          <w:hyperlink w:anchor="_Toc240904044" w:history="1">
             <w:r>
               <w:rPr>
                 <w:rStyle w:val="Lienhypertexte"/>
@@ -753,7 +753,7 @@
               <w:rPr>
                 <w:noProof/>
               </w:rPr>
-              <w:instrText xml:space="preserve"> PAGEREF _Toc240902357 \h </w:instrText>
+              <w:instrText xml:space="preserve"> PAGEREF _Toc240904044 \h </w:instrText>
             </w:r>
             <w:r>
               <w:rPr>
@@ -795,7 +795,7 @@
               <w14:ligatures w14:val="standardContextual"/>
             </w:rPr>
           </w:pPr>
-          <w:hyperlink w:anchor="_Toc240902358" w:history="1">
+          <w:hyperlink w:anchor="_Toc240904045" w:history="1">
             <w:r>
               <w:rPr>
                 <w:rStyle w:val="Lienhypertexte"/>
@@ -819,7 +819,7 @@
               <w:rPr>
                 <w:noProof/>
               </w:rPr>
-              <w:instrText xml:space="preserve"> PAGEREF _Toc240902358 \h </w:instrText>
+              <w:instrText xml:space="preserve"> PAGEREF _Toc240904045 \h </w:instrText>
             </w:r>
             <w:r>
               <w:rPr>
@@ -861,7 +861,7 @@
               <w14:ligatures w14:val="standardContextual"/>
             </w:rPr>
           </w:pPr>
-          <w:hyperlink w:anchor="_Toc240902359" w:history="1">
+          <w:hyperlink w:anchor="_Toc240904046" w:history="1">
             <w:r>
               <w:rPr>
                 <w:rStyle w:val="Lienhypertexte"/>
@@ -885,7 +885,7 @@
               <w:rPr>
                 <w:noProof/>
               </w:rPr>
-              <w:instrText xml:space="preserve"> PAGEREF _Toc240902359 \h </w:instrText>
+              <w:instrText xml:space="preserve"> PAGEREF _Toc240904046 \h </w:instrText>
             </w:r>
             <w:r>
               <w:rPr>
@@ -927,7 +927,7 @@
               <w14:ligatures w14:val="standardContextual"/>
             </w:rPr>
           </w:pPr>
-          <w:hyperlink w:anchor="_Toc240902360" w:history="1">
+          <w:hyperlink w:anchor="_Toc240904047" w:history="1">
             <w:r>
               <w:rPr>
                 <w:rStyle w:val="Lienhypertexte"/>
@@ -951,7 +951,7 @@
               <w:rPr>
                 <w:noProof/>
               </w:rPr>
-              <w:instrText xml:space="preserve"> PAGEREF _Toc240902360 \h </w:instrText>
+              <w:instrText xml:space="preserve"> PAGEREF _Toc240904047 \h </w:instrText>
             </w:r>
             <w:r>
               <w:rPr>
@@ -993,7 +993,7 @@
               <w14:ligatures w14:val="standardContextual"/>
             </w:rPr>
           </w:pPr>
-          <w:hyperlink w:anchor="_Toc240902361" w:history="1">
+          <w:hyperlink w:anchor="_Toc240904048" w:history="1">
             <w:r>
               <w:rPr>
                 <w:rStyle w:val="Lienhypertexte"/>
@@ -1017,7 +1017,7 @@
               <w:rPr>
                 <w:noProof/>
               </w:rPr>
-              <w:instrText xml:space="preserve"> PAGEREF _Toc240902361 \h </w:instrText>
+              <w:instrText xml:space="preserve"> PAGEREF _Toc240904048 \h </w:instrText>
             </w:r>
             <w:r>
               <w:rPr>
@@ -1059,7 +1059,7 @@
               <w14:ligatures w14:val="standardContextual"/>
             </w:rPr>
           </w:pPr>
-          <w:hyperlink w:anchor="_Toc240902362" w:history="1">
+          <w:hyperlink w:anchor="_Toc240904049" w:history="1">
             <w:r>
               <w:rPr>
                 <w:rStyle w:val="Lienhypertexte"/>
@@ -1083,7 +1083,7 @@
               <w:rPr>
                 <w:noProof/>
               </w:rPr>
-              <w:instrText xml:space="preserve"> PAGEREF _Toc240902362 \h </w:instrText>
+              <w:instrText xml:space="preserve"> PAGEREF _Toc240904049 \h </w:instrText>
             </w:r>
             <w:r>
               <w:rPr>
@@ -1125,7 +1125,7 @@
               <w14:ligatures w14:val="standardContextual"/>
             </w:rPr>
           </w:pPr>
-          <w:hyperlink w:anchor="_Toc240902363" w:history="1">
+          <w:hyperlink w:anchor="_Toc240904050" w:history="1">
             <w:r>
               <w:rPr>
                 <w:rStyle w:val="Lienhypertexte"/>
@@ -1149,7 +1149,7 @@
               <w:rPr>
                 <w:noProof/>
               </w:rPr>
-              <w:instrText xml:space="preserve"> PAGEREF _Toc240902363 \h </w:instrText>
+              <w:instrText xml:space="preserve"> PAGEREF _Toc240904050 \h </w:instrText>
             </w:r>
             <w:r>
               <w:rPr>
@@ -1191,7 +1191,7 @@
               <w14:ligatures w14:val="standardContextual"/>
             </w:rPr>
           </w:pPr>
-          <w:hyperlink w:anchor="_Toc240902364" w:history="1">
+          <w:hyperlink w:anchor="_Toc240904051" w:history="1">
             <w:r>
               <w:rPr>
                 <w:rStyle w:val="Lienhypertexte"/>
@@ -1215,7 +1215,7 @@
               <w:rPr>
                 <w:noProof/>
               </w:rPr>
-              <w:instrText xml:space="preserve"> PAGEREF _Toc240902364 \h </w:instrText>
+              <w:instrText xml:space="preserve"> PAGEREF _Toc240904051 \h </w:instrText>
             </w:r>
             <w:r>
               <w:rPr>
@@ -1257,7 +1257,7 @@
               <w14:ligatures w14:val="standardContextual"/>
             </w:rPr>
           </w:pPr>
-          <w:hyperlink w:anchor="_Toc240902365" w:history="1">
+          <w:hyperlink w:anchor="_Toc240904052" w:history="1">
             <w:r>
               <w:rPr>
                 <w:rStyle w:val="Lienhypertexte"/>
@@ -1281,7 +1281,7 @@
               <w:rPr>
                 <w:noProof/>
               </w:rPr>
-              <w:instrText xml:space="preserve"> PAGEREF _Toc240902365 \h </w:instrText>
+              <w:instrText xml:space="preserve"> PAGEREF _Toc240904052 \h </w:instrText>
             </w:r>
             <w:r>
               <w:rPr>
@@ -1323,7 +1323,7 @@
               <w14:ligatures w14:val="standardContextual"/>
             </w:rPr>
           </w:pPr>
-          <w:hyperlink w:anchor="_Toc240902366" w:history="1">
+          <w:hyperlink w:anchor="_Toc240904053" w:history="1">
             <w:r>
               <w:rPr>
                 <w:rStyle w:val="Lienhypertexte"/>
@@ -1347,7 +1347,7 @@
               <w:rPr>
                 <w:noProof/>
               </w:rPr>
-              <w:instrText xml:space="preserve"> PAGEREF _Toc240902366 \h </w:instrText>
+              <w:instrText xml:space="preserve"> PAGEREF _Toc240904053 \h </w:instrText>
             </w:r>
             <w:r>
               <w:rPr>
@@ -1389,7 +1389,7 @@
               <w14:ligatures w14:val="standardContextual"/>
             </w:rPr>
           </w:pPr>
-          <w:hyperlink w:anchor="_Toc240902367" w:history="1">
+          <w:hyperlink w:anchor="_Toc240904054" w:history="1">
             <w:r>
               <w:rPr>
                 <w:rStyle w:val="Lienhypertexte"/>
@@ -1413,7 +1413,7 @@
               <w:rPr>
                 <w:noProof/>
               </w:rPr>
-              <w:instrText xml:space="preserve"> PAGEREF _Toc240902367 \h </w:instrText>
+              <w:instrText xml:space="preserve"> PAGEREF _Toc240904054 \h </w:instrText>
             </w:r>
             <w:r>
               <w:rPr>
@@ -1455,7 +1455,7 @@
               <w14:ligatures w14:val="standardContextual"/>
             </w:rPr>
           </w:pPr>
-          <w:hyperlink w:anchor="_Toc240902368" w:history="1">
+          <w:hyperlink w:anchor="_Toc240904055" w:history="1">
             <w:r>
               <w:rPr>
                 <w:rStyle w:val="Lienhypertexte"/>
@@ -1479,7 +1479,7 @@
               <w:rPr>
                 <w:noProof/>
               </w:rPr>
-              <w:instrText xml:space="preserve"> PAGEREF _Toc240902368 \h </w:instrText>
+              <w:instrText xml:space="preserve"> PAGEREF _Toc240904055 \h </w:instrText>
             </w:r>
             <w:r>
               <w:rPr>
@@ -1521,7 +1521,7 @@
               <w14:ligatures w14:val="standardContextual"/>
             </w:rPr>
           </w:pPr>
-          <w:hyperlink w:anchor="_Toc240902369" w:history="1">
+          <w:hyperlink w:anchor="_Toc240904056" w:history="1">
             <w:r>
               <w:rPr>
                 <w:rStyle w:val="Lienhypertexte"/>
@@ -1545,7 +1545,7 @@
               <w:rPr>
                 <w:noProof/>
               </w:rPr>
-              <w:instrText xml:space="preserve"> PAGEREF _Toc240902369 \h </w:instrText>
+              <w:instrText xml:space="preserve"> PAGEREF _Toc240904056 \h </w:instrText>
             </w:r>
             <w:r>
               <w:rPr>
@@ -1587,7 +1587,7 @@
               <w14:ligatures w14:val="standardContextual"/>
             </w:rPr>
           </w:pPr>
-          <w:hyperlink w:anchor="_Toc240902370" w:history="1">
+          <w:hyperlink w:anchor="_Toc240904057" w:history="1">
             <w:r>
               <w:rPr>
                 <w:rStyle w:val="Lienhypertexte"/>
@@ -1611,7 +1611,7 @@
               <w:rPr>
                 <w:noProof/>
               </w:rPr>
-              <w:instrText xml:space="preserve"> PAGEREF _Toc240902370 \h </w:instrText>
+              <w:instrText xml:space="preserve"> PAGEREF _Toc240904057 \h </w:instrText>
             </w:r>
             <w:r>
               <w:rPr>
@@ -1653,7 +1653,7 @@
               <w14:ligatures w14:val="standardContextual"/>
             </w:rPr>
           </w:pPr>
-          <w:hyperlink w:anchor="_Toc240902371" w:history="1">
+          <w:hyperlink w:anchor="_Toc240904058" w:history="1">
             <w:r>
               <w:rPr>
                 <w:rStyle w:val="Lienhypertexte"/>
@@ -1677,7 +1677,7 @@
               <w:rPr>
                 <w:noProof/>
               </w:rPr>
-              <w:instrText xml:space="preserve"> PAGEREF _Toc240902371 \h </w:instrText>
+              <w:instrText xml:space="preserve"> PAGEREF _Toc240904058 \h </w:instrText>
             </w:r>
             <w:r>
               <w:rPr>
@@ -1719,7 +1719,7 @@
               <w14:ligatures w14:val="standardContextual"/>
             </w:rPr>
           </w:pPr>
-          <w:hyperlink w:anchor="_Toc240902372" w:history="1">
+          <w:hyperlink w:anchor="_Toc240904059" w:history="1">
             <w:r>
               <w:rPr>
                 <w:rStyle w:val="Lienhypertexte"/>
@@ -1743,7 +1743,7 @@
               <w:rPr>
                 <w:noProof/>
               </w:rPr>
-              <w:instrText xml:space="preserve"> PAGEREF _Toc240902372 \h </w:instrText>
+              <w:instrText xml:space="preserve"> PAGEREF _Toc240904059 \h </w:instrText>
             </w:r>
             <w:r>
               <w:rPr>
@@ -1785,7 +1785,7 @@
               <w14:ligatures w14:val="standardContextual"/>
             </w:rPr>
           </w:pPr>
-          <w:hyperlink w:anchor="_Toc240902373" w:history="1">
+          <w:hyperlink w:anchor="_Toc240904060" w:history="1">
             <w:r>
               <w:rPr>
                 <w:rStyle w:val="Lienhypertexte"/>
@@ -1809,7 +1809,7 @@
               <w:rPr>
                 <w:noProof/>
               </w:rPr>
-              <w:instrText xml:space="preserve"> PAGEREF _Toc240902373 \h </w:instrText>
+              <w:instrText xml:space="preserve"> PAGEREF _Toc240904060 \h </w:instrText>
             </w:r>
             <w:r>
               <w:rPr>
@@ -1851,7 +1851,7 @@
               <w14:ligatures w14:val="standardContextual"/>
             </w:rPr>
           </w:pPr>
-          <w:hyperlink w:anchor="_Toc240902374" w:history="1">
+          <w:hyperlink w:anchor="_Toc240904061" w:history="1">
             <w:r>
               <w:rPr>
                 <w:rStyle w:val="Lienhypertexte"/>
@@ -1875,7 +1875,7 @@
               <w:rPr>
                 <w:noProof/>
               </w:rPr>
-              <w:instrText xml:space="preserve"> PAGEREF _Toc240902374 \h </w:instrText>
+              <w:instrText xml:space="preserve"> PAGEREF _Toc240904061 \h </w:instrText>
             </w:r>
             <w:r>
               <w:rPr>
@@ -1917,7 +1917,7 @@
               <w14:ligatures w14:val="standardContextual"/>
             </w:rPr>
           </w:pPr>
-          <w:hyperlink w:anchor="_Toc240902375" w:history="1">
+          <w:hyperlink w:anchor="_Toc240904062" w:history="1">
             <w:r>
               <w:rPr>
                 <w:rStyle w:val="Lienhypertexte"/>
@@ -1941,7 +1941,7 @@
               <w:rPr>
                 <w:noProof/>
               </w:rPr>
-              <w:instrText xml:space="preserve"> PAGEREF _Toc240902375 \h </w:instrText>
+              <w:instrText xml:space="preserve"> PAGEREF _Toc240904062 \h </w:instrText>
             </w:r>
             <w:r>
               <w:rPr>
@@ -1983,7 +1983,7 @@
               <w14:ligatures w14:val="standardContextual"/>
             </w:rPr>
           </w:pPr>
-          <w:hyperlink w:anchor="_Toc240902376" w:history="1">
+          <w:hyperlink w:anchor="_Toc240904063" w:history="1">
             <w:r>
               <w:rPr>
                 <w:rStyle w:val="Lienhypertexte"/>
@@ -2007,7 +2007,7 @@
               <w:rPr>
                 <w:noProof/>
               </w:rPr>
-              <w:instrText xml:space="preserve"> PAGEREF _Toc240902376 \h </w:instrText>
+              <w:instrText xml:space="preserve"> PAGEREF _Toc240904063 \h </w:instrText>
             </w:r>
             <w:r>
               <w:rPr>
@@ -2049,7 +2049,7 @@
               <w14:ligatures w14:val="standardContextual"/>
             </w:rPr>
           </w:pPr>
-          <w:hyperlink w:anchor="_Toc240902377" w:history="1">
+          <w:hyperlink w:anchor="_Toc240904064" w:history="1">
             <w:r>
               <w:rPr>
                 <w:rStyle w:val="Lienhypertexte"/>
@@ -2073,7 +2073,7 @@
               <w:rPr>
                 <w:noProof/>
               </w:rPr>
-              <w:instrText xml:space="preserve"> PAGEREF _Toc240902377 \h </w:instrText>
+              <w:instrText xml:space="preserve"> PAGEREF _Toc240904064 \h </w:instrText>
             </w:r>
             <w:r>
               <w:rPr>
@@ -2115,7 +2115,7 @@
               <w14:ligatures w14:val="standardContextual"/>
             </w:rPr>
           </w:pPr>
-          <w:hyperlink w:anchor="_Toc240902378" w:history="1">
+          <w:hyperlink w:anchor="_Toc240904065" w:history="1">
             <w:r>
               <w:rPr>
                 <w:rStyle w:val="Lienhypertexte"/>
@@ -2139,7 +2139,7 @@
               <w:rPr>
                 <w:noProof/>
               </w:rPr>
-              <w:instrText xml:space="preserve"> PAGEREF _Toc240902378 \h </w:instrText>
+              <w:instrText xml:space="preserve"> PAGEREF _Toc240904065 \h </w:instrText>
             </w:r>
             <w:r>
               <w:rPr>
@@ -2181,7 +2181,7 @@
               <w14:ligatures w14:val="standardContextual"/>
             </w:rPr>
           </w:pPr>
-          <w:hyperlink w:anchor="_Toc240902379" w:history="1">
+          <w:hyperlink w:anchor="_Toc240904066" w:history="1">
             <w:r>
               <w:rPr>
                 <w:rStyle w:val="Lienhypertexte"/>
@@ -2205,7 +2205,7 @@
               <w:rPr>
                 <w:noProof/>
               </w:rPr>
-              <w:instrText xml:space="preserve"> PAGEREF _Toc240902379 \h </w:instrText>
+              <w:instrText xml:space="preserve"> PAGEREF _Toc240904066 \h </w:instrText>
             </w:r>
             <w:r>
               <w:rPr>
@@ -2263,7 +2263,7 @@
       <w:pPr>
         <w:pStyle w:val="Titre1"/>
       </w:pPr>
-      <w:bookmarkStart w:id="0" w:name="_Toc240902348"/>
+      <w:bookmarkStart w:id="0" w:name="_Toc240904035"/>
       <w:r>
         <w:lastRenderedPageBreak/>
         <w:t>1. L’essentiel en une page</w:t>
@@ -2484,7 +2484,7 @@
           <w:left w:w="10" w:type="dxa"/>
           <w:right w:w="10" w:type="dxa"/>
         </w:tblCellMar>
-        <w:tblLook w:val="04A0" w:firstRow="1" w:lastRow="0" w:firstColumn="1" w:lastColumn="0" w:noHBand="0" w:noVBand="1"/>
+        <w:tblLook w:val="0000" w:firstRow="0" w:lastRow="0" w:firstColumn="0" w:lastColumn="0" w:noHBand="0" w:noVBand="0"/>
       </w:tblPr>
       <w:tblGrid>
         <w:gridCol w:w="9638"/>
@@ -2569,7 +2569,7 @@
       <w:pPr>
         <w:pStyle w:val="Titre1"/>
       </w:pPr>
-      <w:bookmarkStart w:id="1" w:name="_Toc240902349"/>
+      <w:bookmarkStart w:id="1" w:name="_Toc240904036"/>
       <w:r>
         <w:lastRenderedPageBreak/>
         <w:t>2. Vue d’ensemble</w:t>
@@ -2604,7 +2604,7 @@
           <w:left w:w="10" w:type="dxa"/>
           <w:right w:w="10" w:type="dxa"/>
         </w:tblCellMar>
-        <w:tblLook w:val="04A0" w:firstRow="1" w:lastRow="0" w:firstColumn="1" w:lastColumn="0" w:noHBand="0" w:noVBand="1"/>
+        <w:tblLook w:val="0000" w:firstRow="0" w:lastRow="0" w:firstColumn="0" w:lastColumn="0" w:noHBand="0" w:noVBand="0"/>
       </w:tblPr>
       <w:tblGrid>
         <w:gridCol w:w="2200"/>
@@ -3664,7 +3664,7 @@
       <w:pPr>
         <w:pStyle w:val="Titre2"/>
       </w:pPr>
-      <w:bookmarkStart w:id="2" w:name="_Toc240902350"/>
+      <w:bookmarkStart w:id="2" w:name="_Toc240904037"/>
       <w:r>
         <w:t>Les sept rôles</w:t>
       </w:r>
@@ -3703,7 +3703,7 @@
           <w:left w:w="10" w:type="dxa"/>
           <w:right w:w="10" w:type="dxa"/>
         </w:tblCellMar>
-        <w:tblLook w:val="04A0" w:firstRow="1" w:lastRow="0" w:firstColumn="1" w:lastColumn="0" w:noHBand="0" w:noVBand="1"/>
+        <w:tblLook w:val="0000" w:firstRow="0" w:lastRow="0" w:firstColumn="0" w:lastColumn="0" w:noHBand="0" w:noVBand="0"/>
       </w:tblPr>
       <w:tblGrid>
         <w:gridCol w:w="2600"/>
@@ -4295,7 +4295,7 @@
       <w:pPr>
         <w:pStyle w:val="Titre1"/>
       </w:pPr>
-      <w:bookmarkStart w:id="3" w:name="_Toc240902351"/>
+      <w:bookmarkStart w:id="3" w:name="_Toc240904038"/>
       <w:r>
         <w:t>3. Qui peut faire quoi</w:t>
       </w:r>
@@ -4349,7 +4349,7 @@
           <w:left w:w="10" w:type="dxa"/>
           <w:right w:w="10" w:type="dxa"/>
         </w:tblCellMar>
-        <w:tblLook w:val="04A0" w:firstRow="1" w:lastRow="0" w:firstColumn="1" w:lastColumn="0" w:noHBand="0" w:noVBand="1"/>
+        <w:tblLook w:val="0000" w:firstRow="0" w:lastRow="0" w:firstColumn="0" w:lastColumn="0" w:noHBand="0" w:noVBand="0"/>
       </w:tblPr>
       <w:tblGrid>
         <w:gridCol w:w="1620"/>
@@ -7672,7 +7672,7 @@
                 <w:sz w:val="17"/>
                 <w:szCs w:val="17"/>
               </w:rPr>
-              <w:t>Lit</w:t>
+              <w:t>Lit*</w:t>
             </w:r>
           </w:p>
         </w:tc>
@@ -7838,7 +7838,7 @@
           <w:iCs/>
           <w:color w:val="5B5B5B"/>
         </w:rPr>
-        <w:t>La section suivante montre l’interface de chaque rôle. Le tableau de bord d’accueil existe pour chaque rôle et n’affiche que les blocs auxquels le rôle a droit. Un supérieur hiérarchique valide les congés de son équipe quel que soit son rôle : ce droit vient de l’organigramme, pas du rôle.</w:t>
+        <w:t>* Le journal d’audit se lit dans l’espace d’administration : l’Administrateur y a accès, la Direction en lecture seule une fois cet accès activé sur son compte. La section suivante montre l’interface de chaque rôle. Le tableau de bord d’accueil existe pour chaque rôle et n’affiche que les blocs auxquels le rôle a droit. Un supérieur hiérarchique valide les congés de son équipe quel que soit son rôle : ce droit vient de l’organigramme, pas du rôle.</w:t>
       </w:r>
     </w:p>
     <w:p>
@@ -7850,7 +7850,7 @@
       <w:pPr>
         <w:pStyle w:val="Titre1"/>
       </w:pPr>
-      <w:bookmarkStart w:id="4" w:name="_Toc240902352"/>
+      <w:bookmarkStart w:id="4" w:name="_Toc240904039"/>
       <w:r>
         <w:lastRenderedPageBreak/>
         <w:t>4. L’interface de chaque utilisateur</w:t>
@@ -7890,7 +7890,7 @@
           <w:left w:w="10" w:type="dxa"/>
           <w:right w:w="10" w:type="dxa"/>
         </w:tblCellMar>
-        <w:tblLook w:val="04A0" w:firstRow="1" w:lastRow="0" w:firstColumn="1" w:lastColumn="0" w:noHBand="0" w:noVBand="1"/>
+        <w:tblLook w:val="0000" w:firstRow="0" w:lastRow="0" w:firstColumn="0" w:lastColumn="0" w:noHBand="0" w:noVBand="0"/>
       </w:tblPr>
       <w:tblGrid>
         <w:gridCol w:w="9638"/>
@@ -7978,7 +7978,7 @@
           <w:noProof/>
         </w:rPr>
         <w:drawing>
-          <wp:inline distT="0" distB="0" distL="0" distR="0" wp14:anchorId="2DCE426D" wp14:editId="5CD71DBF">
+          <wp:inline distT="0" distB="0" distL="0" distR="0" wp14:anchorId="3DA92B9A" wp14:editId="1DFA8C1D">
             <wp:extent cx="3810000" cy="2381250"/>
             <wp:effectExtent l="0" t="0" r="0" b="0"/>
             <wp:docPr id="1" name="r_refus_rh" descr="Un utilisateur qui tente d’ouvrir un écran hors de son rôle (ici la RH sur la facturation) reçoit « Accès refusé »." title="Un utilisateur qui tente d’ouvrir un écran hors de son rôle (ici la RH sur la facturation) reçoit « Accès refusé »."/>
@@ -8038,7 +8038,7 @@
         <w:pStyle w:val="Titre2"/>
         <w:pageBreakBefore/>
       </w:pPr>
-      <w:bookmarkStart w:id="5" w:name="_Toc240902353"/>
+      <w:bookmarkStart w:id="5" w:name="_Toc240904040"/>
       <w:r>
         <w:lastRenderedPageBreak/>
         <w:t>4.1 Administrateur</w:t>
@@ -8122,7 +8122,7 @@
           <w:left w:w="10" w:type="dxa"/>
           <w:right w:w="10" w:type="dxa"/>
         </w:tblCellMar>
-        <w:tblLook w:val="04A0" w:firstRow="1" w:lastRow="0" w:firstColumn="1" w:lastColumn="0" w:noHBand="0" w:noVBand="1"/>
+        <w:tblLook w:val="0000" w:firstRow="0" w:lastRow="0" w:firstColumn="0" w:lastColumn="0" w:noHBand="0" w:noVBand="0"/>
       </w:tblPr>
       <w:tblGrid>
         <w:gridCol w:w="4819"/>
@@ -8410,7 +8410,7 @@
                 <w:sz w:val="20"/>
                 <w:szCs w:val="20"/>
               </w:rPr>
-              <w:t>.</w:t>
+              <w:t xml:space="preserve"> (dans l’espace d’administration).</w:t>
             </w:r>
           </w:p>
           <w:p>
@@ -8599,7 +8599,7 @@
           <w:noProof/>
         </w:rPr>
         <w:drawing>
-          <wp:inline distT="0" distB="0" distL="0" distR="0" wp14:anchorId="439D1389" wp14:editId="7C033EDD">
+          <wp:inline distT="0" distB="0" distL="0" distR="0" wp14:anchorId="2FDDEDDB" wp14:editId="6FFAC2AC">
             <wp:extent cx="3667125" cy="2295525"/>
             <wp:effectExtent l="0" t="0" r="0" b="0"/>
             <wp:docPr id="2" name="r_admin_accueil" descr="Administrateur : le menu complet et tous les blocs du tableau de bord." title="Administrateur : le menu complet et tous les blocs du tableau de bord."/>
@@ -8659,7 +8659,7 @@
         <w:pStyle w:val="Titre2"/>
         <w:pageBreakBefore/>
       </w:pPr>
-      <w:bookmarkStart w:id="6" w:name="_Toc240902354"/>
+      <w:bookmarkStart w:id="6" w:name="_Toc240904041"/>
       <w:r>
         <w:lastRenderedPageBreak/>
         <w:t>4.2 Direction</w:t>
@@ -8743,7 +8743,7 @@
           <w:left w:w="10" w:type="dxa"/>
           <w:right w:w="10" w:type="dxa"/>
         </w:tblCellMar>
-        <w:tblLook w:val="04A0" w:firstRow="1" w:lastRow="0" w:firstColumn="1" w:lastColumn="0" w:noHBand="0" w:noVBand="1"/>
+        <w:tblLook w:val="0000" w:firstRow="0" w:lastRow="0" w:firstColumn="0" w:lastColumn="0" w:noHBand="0" w:noVBand="0"/>
       </w:tblPr>
       <w:tblGrid>
         <w:gridCol w:w="4819"/>
@@ -9004,7 +9004,7 @@
                 <w:sz w:val="20"/>
                 <w:szCs w:val="20"/>
               </w:rPr>
-              <w:t xml:space="preserve"> (lecture seule).</w:t>
+              <w:t xml:space="preserve"> en lecture seule, une fois l’accès à l’espace d’administration activé sur son compte.</w:t>
             </w:r>
           </w:p>
         </w:tc>
@@ -9126,7 +9126,7 @@
           <w:noProof/>
         </w:rPr>
         <w:drawing>
-          <wp:inline distT="0" distB="0" distL="0" distR="0" wp14:anchorId="238FAB28" wp14:editId="59A5F592">
+          <wp:inline distT="0" distB="0" distL="0" distR="0" wp14:anchorId="020B31B5" wp14:editId="027E8B8E">
             <wp:extent cx="3190875" cy="1990725"/>
             <wp:effectExtent l="0" t="0" r="0" b="0"/>
             <wp:docPr id="3" name="r_direction_accueil" descr="Direction : même menu que l’Administrateur, avec la validation des factures en plus." title="Direction : même menu que l’Administrateur, avec la validation des factures en plus."/>
@@ -9193,7 +9193,7 @@
           <w:noProof/>
         </w:rPr>
         <w:drawing>
-          <wp:inline distT="0" distB="0" distL="0" distR="0" wp14:anchorId="4ECACC49" wp14:editId="550BFC16">
+          <wp:inline distT="0" distB="0" distL="0" distR="0" wp14:anchorId="4BBC6CCD" wp14:editId="16A6D760">
             <wp:extent cx="3190875" cy="1990725"/>
             <wp:effectExtent l="0" t="0" r="0" b="0"/>
             <wp:docPr id="4" name="r_direction_facture" descr="Direction : une facture à valider, avec « Valider et émettre » ou « Renvoyer en brouillon »." title="Direction : une facture à valider, avec « Valider et émettre » ou « Renvoyer en brouillon »."/>
@@ -9253,7 +9253,7 @@
         <w:pStyle w:val="Titre2"/>
         <w:pageBreakBefore/>
       </w:pPr>
-      <w:bookmarkStart w:id="7" w:name="_Toc240902355"/>
+      <w:bookmarkStart w:id="7" w:name="_Toc240904042"/>
       <w:r>
         <w:lastRenderedPageBreak/>
         <w:t>4.3 Ressources humaines</w:t>
@@ -9337,7 +9337,7 @@
           <w:left w:w="10" w:type="dxa"/>
           <w:right w:w="10" w:type="dxa"/>
         </w:tblCellMar>
-        <w:tblLook w:val="04A0" w:firstRow="1" w:lastRow="0" w:firstColumn="1" w:lastColumn="0" w:noHBand="0" w:noVBand="1"/>
+        <w:tblLook w:val="0000" w:firstRow="0" w:lastRow="0" w:firstColumn="0" w:lastColumn="0" w:noHBand="0" w:noVBand="0"/>
       </w:tblPr>
       <w:tblGrid>
         <w:gridCol w:w="4819"/>
@@ -9653,7 +9653,7 @@
           <w:noProof/>
         </w:rPr>
         <w:drawing>
-          <wp:inline distT="0" distB="0" distL="0" distR="0" wp14:anchorId="47D2C397" wp14:editId="7BA64B66">
+          <wp:inline distT="0" distB="0" distL="0" distR="0" wp14:anchorId="19A14715" wp14:editId="5B30B5DC">
             <wp:extent cx="3667125" cy="2295525"/>
             <wp:effectExtent l="0" t="0" r="0" b="0"/>
             <wp:docPr id="5" name="r_rh_accueil" descr="Ressources humaines : un menu de quatre écrans et un tableau de bord tourné vers l’effectif." title="Ressources humaines : un menu de quatre écrans et un tableau de bord tourné vers l’effectif."/>
@@ -9720,7 +9720,7 @@
           <w:noProof/>
         </w:rPr>
         <w:drawing>
-          <wp:inline distT="0" distB="0" distL="0" distR="0" wp14:anchorId="35A77633" wp14:editId="746E5CF7">
+          <wp:inline distT="0" distB="0" distL="0" distR="0" wp14:anchorId="76BDB2D4" wp14:editId="66825D28">
             <wp:extent cx="3667125" cy="2295525"/>
             <wp:effectExtent l="0" t="0" r="0" b="0"/>
             <wp:docPr id="6" name="r_rh_conge" descr="Ressources humaines : la décision de second niveau sur une demande de congé." title="Ressources humaines : la décision de second niveau sur une demande de congé."/>
@@ -9780,7 +9780,7 @@
         <w:pStyle w:val="Titre2"/>
         <w:pageBreakBefore/>
       </w:pPr>
-      <w:bookmarkStart w:id="8" w:name="_Toc240902356"/>
+      <w:bookmarkStart w:id="8" w:name="_Toc240904043"/>
       <w:r>
         <w:lastRenderedPageBreak/>
         <w:t>4.4 Chargé de clientèle</w:t>
@@ -9864,7 +9864,7 @@
           <w:left w:w="10" w:type="dxa"/>
           <w:right w:w="10" w:type="dxa"/>
         </w:tblCellMar>
-        <w:tblLook w:val="04A0" w:firstRow="1" w:lastRow="0" w:firstColumn="1" w:lastColumn="0" w:noHBand="0" w:noVBand="1"/>
+        <w:tblLook w:val="0000" w:firstRow="0" w:lastRow="0" w:firstColumn="0" w:lastColumn="0" w:noHBand="0" w:noVBand="0"/>
       </w:tblPr>
       <w:tblGrid>
         <w:gridCol w:w="4819"/>
@@ -10178,7 +10178,7 @@
           <w:noProof/>
         </w:rPr>
         <w:drawing>
-          <wp:inline distT="0" distB="0" distL="0" distR="0" wp14:anchorId="48F152C9" wp14:editId="6D01C7F4">
+          <wp:inline distT="0" distB="0" distL="0" distR="0" wp14:anchorId="323CC856" wp14:editId="60DE47EF">
             <wp:extent cx="3667125" cy="2295525"/>
             <wp:effectExtent l="0" t="0" r="0" b="0"/>
             <wp:docPr id="7" name="r_charge_accueil" descr="Chargé de clientèle : son tableau de bord, centré sur les clients." title="Chargé de clientèle : son tableau de bord, centré sur les clients."/>
@@ -10245,7 +10245,7 @@
           <w:noProof/>
         </w:rPr>
         <w:drawing>
-          <wp:inline distT="0" distB="0" distL="0" distR="0" wp14:anchorId="7860BACC" wp14:editId="31EB1853">
+          <wp:inline distT="0" distB="0" distL="0" distR="0" wp14:anchorId="4A7A7A9C" wp14:editId="57BE83E5">
             <wp:extent cx="3667125" cy="2295525"/>
             <wp:effectExtent l="0" t="0" r="0" b="0"/>
             <wp:docPr id="8" name="r_charge_missions" descr="Chargé de clientèle : la liste des missions et le bouton « Nouvelle mission »." title="Chargé de clientèle : la liste des missions et le bouton « Nouvelle mission »."/>
@@ -10305,7 +10305,7 @@
         <w:pStyle w:val="Titre2"/>
         <w:pageBreakBefore/>
       </w:pPr>
-      <w:bookmarkStart w:id="9" w:name="_Toc240902357"/>
+      <w:bookmarkStart w:id="9" w:name="_Toc240904044"/>
       <w:r>
         <w:lastRenderedPageBreak/>
         <w:t>4.5 Parc auto</w:t>
@@ -10389,7 +10389,7 @@
           <w:left w:w="10" w:type="dxa"/>
           <w:right w:w="10" w:type="dxa"/>
         </w:tblCellMar>
-        <w:tblLook w:val="04A0" w:firstRow="1" w:lastRow="0" w:firstColumn="1" w:lastColumn="0" w:noHBand="0" w:noVBand="1"/>
+        <w:tblLook w:val="0000" w:firstRow="0" w:lastRow="0" w:firstColumn="0" w:lastColumn="0" w:noHBand="0" w:noVBand="0"/>
       </w:tblPr>
       <w:tblGrid>
         <w:gridCol w:w="4819"/>
@@ -10720,7 +10720,7 @@
           <w:noProof/>
         </w:rPr>
         <w:drawing>
-          <wp:inline distT="0" distB="0" distL="0" distR="0" wp14:anchorId="2310F781" wp14:editId="5CF3D10D">
+          <wp:inline distT="0" distB="0" distL="0" distR="0" wp14:anchorId="42D6BE22" wp14:editId="4349054E">
             <wp:extent cx="3190875" cy="1990725"/>
             <wp:effectExtent l="0" t="0" r="0" b="0"/>
             <wp:docPr id="9" name="r_parc_accueil" descr="Parc auto : alertes sur les camions, les pièces, la consommation et les incidents." title="Parc auto : alertes sur les camions, les pièces, la consommation et les incidents."/>
@@ -10787,7 +10787,7 @@
           <w:noProof/>
         </w:rPr>
         <w:drawing>
-          <wp:inline distT="0" distB="0" distL="0" distR="0" wp14:anchorId="10A7BA9D" wp14:editId="0DAED92D">
+          <wp:inline distT="0" distB="0" distL="0" distR="0" wp14:anchorId="635D4AD7" wp14:editId="0D0CFB37">
             <wp:extent cx="3190875" cy="1990725"/>
             <wp:effectExtent l="0" t="0" r="0" b="0"/>
             <wp:docPr id="10" name="r_parc_garage" descr="Parc auto : les ordres de réparation et le bouton « Nouvel OR »." title="Parc auto : les ordres de réparation et le bouton « Nouvel OR »."/>
@@ -10847,7 +10847,7 @@
         <w:pStyle w:val="Titre2"/>
         <w:pageBreakBefore/>
       </w:pPr>
-      <w:bookmarkStart w:id="10" w:name="_Toc240902358"/>
+      <w:bookmarkStart w:id="10" w:name="_Toc240904045"/>
       <w:r>
         <w:lastRenderedPageBreak/>
         <w:t>4.6 Finances</w:t>
@@ -10931,7 +10931,7 @@
           <w:left w:w="10" w:type="dxa"/>
           <w:right w:w="10" w:type="dxa"/>
         </w:tblCellMar>
-        <w:tblLook w:val="04A0" w:firstRow="1" w:lastRow="0" w:firstColumn="1" w:lastColumn="0" w:noHBand="0" w:noVBand="1"/>
+        <w:tblLook w:val="0000" w:firstRow="0" w:lastRow="0" w:firstColumn="0" w:lastColumn="0" w:noHBand="0" w:noVBand="0"/>
       </w:tblPr>
       <w:tblGrid>
         <w:gridCol w:w="4819"/>
@@ -11271,7 +11271,7 @@
           <w:noProof/>
         </w:rPr>
         <w:drawing>
-          <wp:inline distT="0" distB="0" distL="0" distR="0" wp14:anchorId="07CE5969" wp14:editId="1248BE41">
+          <wp:inline distT="0" distB="0" distL="0" distR="0" wp14:anchorId="460E300B" wp14:editId="2955DF47">
             <wp:extent cx="3190875" cy="1990725"/>
             <wp:effectExtent l="0" t="0" r="0" b="0"/>
             <wp:docPr id="11" name="r_fin_accueil" descr="Finances : les indicateurs du mois et les factures échues." title="Finances : les indicateurs du mois et les factures échues."/>
@@ -11338,7 +11338,7 @@
           <w:noProof/>
         </w:rPr>
         <w:drawing>
-          <wp:inline distT="0" distB="0" distL="0" distR="0" wp14:anchorId="0BB7846E" wp14:editId="1A602803">
+          <wp:inline distT="0" distB="0" distL="0" distR="0" wp14:anchorId="5E6372FE" wp14:editId="283F7010">
             <wp:extent cx="3190875" cy="1990725"/>
             <wp:effectExtent l="0" t="0" r="0" b="0"/>
             <wp:docPr id="12" name="r_fin_factures" descr="Finances : la liste des factures, les créances et le bouton « Nouvelle facture »." title="Finances : la liste des factures, les créances et le bouton « Nouvelle facture »."/>
@@ -11398,7 +11398,7 @@
         <w:pStyle w:val="Titre2"/>
         <w:pageBreakBefore/>
       </w:pPr>
-      <w:bookmarkStart w:id="11" w:name="_Toc240902359"/>
+      <w:bookmarkStart w:id="11" w:name="_Toc240904046"/>
       <w:r>
         <w:lastRenderedPageBreak/>
         <w:t>4.7 Chauffeur</w:t>
@@ -11460,7 +11460,7 @@
           <w:left w:w="10" w:type="dxa"/>
           <w:right w:w="10" w:type="dxa"/>
         </w:tblCellMar>
-        <w:tblLook w:val="04A0" w:firstRow="1" w:lastRow="0" w:firstColumn="1" w:lastColumn="0" w:noHBand="0" w:noVBand="1"/>
+        <w:tblLook w:val="0000" w:firstRow="0" w:lastRow="0" w:firstColumn="0" w:lastColumn="0" w:noHBand="0" w:noVBand="0"/>
       </w:tblPr>
       <w:tblGrid>
         <w:gridCol w:w="4819"/>
@@ -11840,7 +11840,7 @@
           <w:left w:w="10" w:type="dxa"/>
           <w:right w:w="10" w:type="dxa"/>
         </w:tblCellMar>
-        <w:tblLook w:val="04A0" w:firstRow="1" w:lastRow="0" w:firstColumn="1" w:lastColumn="0" w:noHBand="0" w:noVBand="1"/>
+        <w:tblLook w:val="0000" w:firstRow="0" w:lastRow="0" w:firstColumn="0" w:lastColumn="0" w:noHBand="0" w:noVBand="0"/>
       </w:tblPr>
       <w:tblGrid>
         <w:gridCol w:w="4819"/>
@@ -11876,7 +11876,7 @@
                 <w:noProof/>
               </w:rPr>
               <w:drawing>
-                <wp:inline distT="0" distB="0" distL="0" distR="0" wp14:anchorId="75EBA978" wp14:editId="6CD14B24">
+                <wp:inline distT="0" distB="0" distL="0" distR="0" wp14:anchorId="24BADDF8" wp14:editId="2FE249DD">
                   <wp:extent cx="1762125" cy="3810000"/>
                   <wp:effectExtent l="0" t="0" r="0" b="0"/>
                   <wp:docPr id="13" name="r_chauf_accueil" descr="Accueil du chauffeur" title="Accueil du chauffeur"/>
@@ -11952,7 +11952,7 @@
                 <w:noProof/>
               </w:rPr>
               <w:drawing>
-                <wp:inline distT="0" distB="0" distL="0" distR="0" wp14:anchorId="343C894F" wp14:editId="116C5E77">
+                <wp:inline distT="0" distB="0" distL="0" distR="0" wp14:anchorId="173863CD" wp14:editId="69597202">
                   <wp:extent cx="1762125" cy="3810000"/>
                   <wp:effectExtent l="0" t="0" r="0" b="0"/>
                   <wp:docPr id="14" name="r_chauf_mission" descr="Une mission, prête à démarrer" title="Une mission, prête à démarrer"/>
@@ -12020,7 +12020,7 @@
         <w:pStyle w:val="Titre1"/>
         <w:pageBreakBefore/>
       </w:pPr>
-      <w:bookmarkStart w:id="12" w:name="_Toc240902360"/>
+      <w:bookmarkStart w:id="12" w:name="_Toc240904047"/>
       <w:r>
         <w:lastRenderedPageBreak/>
         <w:t>5. Les fonctionnalités, module par module</w:t>
@@ -12031,7 +12031,7 @@
       <w:pPr>
         <w:pStyle w:val="Titre2"/>
       </w:pPr>
-      <w:bookmarkStart w:id="13" w:name="_Toc240902361"/>
+      <w:bookmarkStart w:id="13" w:name="_Toc240904048"/>
       <w:r>
         <w:t>5.1 Missions</w:t>
       </w:r>
@@ -12057,7 +12057,7 @@
           <w:noProof/>
         </w:rPr>
         <w:drawing>
-          <wp:inline distT="0" distB="0" distL="0" distR="0" wp14:anchorId="0570A8A4" wp14:editId="4E0251E7">
+          <wp:inline distT="0" distB="0" distL="0" distR="0" wp14:anchorId="27779BF5" wp14:editId="32A6C8B1">
             <wp:extent cx="5143500" cy="3571875"/>
             <wp:effectExtent l="0" t="0" r="0" b="0"/>
             <wp:docPr id="15" name="mission_fiche" descr="Fiche d’une mission : frise du cycle de vie, camion et chauffeur, codes de confirmation et QR." title="Fiche d’une mission : frise du cycle de vie, camion et chauffeur, codes de confirmation et QR."/>
@@ -12328,7 +12328,7 @@
           <w:left w:w="10" w:type="dxa"/>
           <w:right w:w="10" w:type="dxa"/>
         </w:tblCellMar>
-        <w:tblLook w:val="04A0" w:firstRow="1" w:lastRow="0" w:firstColumn="1" w:lastColumn="0" w:noHBand="0" w:noVBand="1"/>
+        <w:tblLook w:val="0000" w:firstRow="0" w:lastRow="0" w:firstColumn="0" w:lastColumn="0" w:noHBand="0" w:noVBand="0"/>
       </w:tblPr>
       <w:tblGrid>
         <w:gridCol w:w="9638"/>
@@ -12397,7 +12397,7 @@
       <w:pPr>
         <w:pStyle w:val="Titre2"/>
       </w:pPr>
-      <w:bookmarkStart w:id="14" w:name="_Toc240902362"/>
+      <w:bookmarkStart w:id="14" w:name="_Toc240904049"/>
       <w:r>
         <w:t>5.2 Flotte : les camions</w:t>
       </w:r>
@@ -12423,7 +12423,7 @@
           <w:noProof/>
         </w:rPr>
         <w:drawing>
-          <wp:inline distT="0" distB="0" distL="0" distR="0" wp14:anchorId="4A0CD8D8" wp14:editId="69E7ACB5">
+          <wp:inline distT="0" distB="0" distL="0" distR="0" wp14:anchorId="436DFB1A" wp14:editId="6D46F540">
             <wp:extent cx="5334000" cy="3333750"/>
             <wp:effectExtent l="0" t="0" r="0" b="0"/>
             <wp:docPr id="16" name="flotte" descr="Liste des camions, avec leur état calculé et l’alerte de documents à renouveler." title="Liste des camions, avec leur état calculé et l’alerte de documents à renouveler."/>
@@ -12624,7 +12624,7 @@
           <w:left w:w="10" w:type="dxa"/>
           <w:right w:w="10" w:type="dxa"/>
         </w:tblCellMar>
-        <w:tblLook w:val="04A0" w:firstRow="1" w:lastRow="0" w:firstColumn="1" w:lastColumn="0" w:noHBand="0" w:noVBand="1"/>
+        <w:tblLook w:val="0000" w:firstRow="0" w:lastRow="0" w:firstColumn="0" w:lastColumn="0" w:noHBand="0" w:noVBand="0"/>
       </w:tblPr>
       <w:tblGrid>
         <w:gridCol w:w="9638"/>
@@ -12694,7 +12694,7 @@
       <w:pPr>
         <w:pStyle w:val="Titre2"/>
       </w:pPr>
-      <w:bookmarkStart w:id="15" w:name="_Toc240902363"/>
+      <w:bookmarkStart w:id="15" w:name="_Toc240904050"/>
       <w:r>
         <w:t>5.3 Chauffeurs</w:t>
       </w:r>
@@ -12841,7 +12841,7 @@
           <w:left w:w="10" w:type="dxa"/>
           <w:right w:w="10" w:type="dxa"/>
         </w:tblCellMar>
-        <w:tblLook w:val="04A0" w:firstRow="1" w:lastRow="0" w:firstColumn="1" w:lastColumn="0" w:noHBand="0" w:noVBand="1"/>
+        <w:tblLook w:val="0000" w:firstRow="0" w:lastRow="0" w:firstColumn="0" w:lastColumn="0" w:noHBand="0" w:noVBand="0"/>
       </w:tblPr>
       <w:tblGrid>
         <w:gridCol w:w="9638"/>
@@ -12910,7 +12910,7 @@
       <w:pPr>
         <w:pStyle w:val="Titre2"/>
       </w:pPr>
-      <w:bookmarkStart w:id="16" w:name="_Toc240902364"/>
+      <w:bookmarkStart w:id="16" w:name="_Toc240904051"/>
       <w:r>
         <w:t>5.4 Garage : réparations, incidents et check-lists</w:t>
       </w:r>
@@ -12936,7 +12936,7 @@
           <w:noProof/>
         </w:rPr>
         <w:drawing>
-          <wp:inline distT="0" distB="0" distL="0" distR="0" wp14:anchorId="77D99E93" wp14:editId="72A57326">
+          <wp:inline distT="0" distB="0" distL="0" distR="0" wp14:anchorId="563B8C2A" wp14:editId="457D0119">
             <wp:extent cx="5334000" cy="3333750"/>
             <wp:effectExtent l="0" t="0" r="0" b="0"/>
             <wp:docPr id="17" name="incidents" descr="Incidents signalés par les chauffeurs, à traiter par le Parc auto." title="Incidents signalés par les chauffeurs, à traiter par le Parc auto."/>
@@ -13241,7 +13241,7 @@
           <w:left w:w="10" w:type="dxa"/>
           <w:right w:w="10" w:type="dxa"/>
         </w:tblCellMar>
-        <w:tblLook w:val="04A0" w:firstRow="1" w:lastRow="0" w:firstColumn="1" w:lastColumn="0" w:noHBand="0" w:noVBand="1"/>
+        <w:tblLook w:val="0000" w:firstRow="0" w:lastRow="0" w:firstColumn="0" w:lastColumn="0" w:noHBand="0" w:noVBand="0"/>
       </w:tblPr>
       <w:tblGrid>
         <w:gridCol w:w="9638"/>
@@ -13310,7 +13310,7 @@
       <w:pPr>
         <w:pStyle w:val="Titre2"/>
       </w:pPr>
-      <w:bookmarkStart w:id="17" w:name="_Toc240902365"/>
+      <w:bookmarkStart w:id="17" w:name="_Toc240904052"/>
       <w:r>
         <w:t>5.5 Stock de pièces détachées</w:t>
       </w:r>
@@ -13536,7 +13536,7 @@
           <w:left w:w="10" w:type="dxa"/>
           <w:right w:w="10" w:type="dxa"/>
         </w:tblCellMar>
-        <w:tblLook w:val="04A0" w:firstRow="1" w:lastRow="0" w:firstColumn="1" w:lastColumn="0" w:noHBand="0" w:noVBand="1"/>
+        <w:tblLook w:val="0000" w:firstRow="0" w:lastRow="0" w:firstColumn="0" w:lastColumn="0" w:noHBand="0" w:noVBand="0"/>
       </w:tblPr>
       <w:tblGrid>
         <w:gridCol w:w="9638"/>
@@ -13606,7 +13606,7 @@
       <w:pPr>
         <w:pStyle w:val="Titre2"/>
       </w:pPr>
-      <w:bookmarkStart w:id="18" w:name="_Toc240902366"/>
+      <w:bookmarkStart w:id="18" w:name="_Toc240904053"/>
       <w:r>
         <w:t>5.6 Carburant</w:t>
       </w:r>
@@ -13632,7 +13632,7 @@
           <w:noProof/>
         </w:rPr>
         <w:drawing>
-          <wp:inline distT="0" distB="0" distL="0" distR="0" wp14:anchorId="503F5B7C" wp14:editId="29A5866E">
+          <wp:inline distT="0" distB="0" distL="0" distR="0" wp14:anchorId="679FEDC0" wp14:editId="7D70DE80">
             <wp:extent cx="5334000" cy="3333750"/>
             <wp:effectExtent l="0" t="0" r="0" b="0"/>
             <wp:docPr id="18" name="carburant" descr="Pleins de carburant, consommation aux 100 km et alertes d’écart." title="Pleins de carburant, consommation aux 100 km et alertes d’écart."/>
@@ -13873,7 +13873,7 @@
           <w:left w:w="10" w:type="dxa"/>
           <w:right w:w="10" w:type="dxa"/>
         </w:tblCellMar>
-        <w:tblLook w:val="04A0" w:firstRow="1" w:lastRow="0" w:firstColumn="1" w:lastColumn="0" w:noHBand="0" w:noVBand="1"/>
+        <w:tblLook w:val="0000" w:firstRow="0" w:lastRow="0" w:firstColumn="0" w:lastColumn="0" w:noHBand="0" w:noVBand="0"/>
       </w:tblPr>
       <w:tblGrid>
         <w:gridCol w:w="9638"/>
@@ -13943,7 +13943,7 @@
       <w:pPr>
         <w:pStyle w:val="Titre2"/>
       </w:pPr>
-      <w:bookmarkStart w:id="19" w:name="_Toc240902367"/>
+      <w:bookmarkStart w:id="19" w:name="_Toc240904054"/>
       <w:r>
         <w:t>5.7 Clients</w:t>
       </w:r>
@@ -14106,7 +14106,7 @@
           <w:left w:w="10" w:type="dxa"/>
           <w:right w:w="10" w:type="dxa"/>
         </w:tblCellMar>
-        <w:tblLook w:val="04A0" w:firstRow="1" w:lastRow="0" w:firstColumn="1" w:lastColumn="0" w:noHBand="0" w:noVBand="1"/>
+        <w:tblLook w:val="0000" w:firstRow="0" w:lastRow="0" w:firstColumn="0" w:lastColumn="0" w:noHBand="0" w:noVBand="0"/>
       </w:tblPr>
       <w:tblGrid>
         <w:gridCol w:w="9638"/>
@@ -14186,7 +14186,7 @@
           <w:left w:w="10" w:type="dxa"/>
           <w:right w:w="10" w:type="dxa"/>
         </w:tblCellMar>
-        <w:tblLook w:val="04A0" w:firstRow="1" w:lastRow="0" w:firstColumn="1" w:lastColumn="0" w:noHBand="0" w:noVBand="1"/>
+        <w:tblLook w:val="0000" w:firstRow="0" w:lastRow="0" w:firstColumn="0" w:lastColumn="0" w:noHBand="0" w:noVBand="0"/>
       </w:tblPr>
       <w:tblGrid>
         <w:gridCol w:w="9638"/>
@@ -14255,7 +14255,7 @@
       <w:pPr>
         <w:pStyle w:val="Titre2"/>
       </w:pPr>
-      <w:bookmarkStart w:id="20" w:name="_Toc240902368"/>
+      <w:bookmarkStart w:id="20" w:name="_Toc240904055"/>
       <w:r>
         <w:t>5.8 Personnel et congés</w:t>
       </w:r>
@@ -14282,7 +14282,7 @@
         </w:rPr>
         <w:lastRenderedPageBreak/>
         <w:drawing>
-          <wp:inline distT="0" distB="0" distL="0" distR="0" wp14:anchorId="4E22F065" wp14:editId="2D6D22A4">
+          <wp:inline distT="0" distB="0" distL="0" distR="0" wp14:anchorId="6E14C916" wp14:editId="2E73431C">
             <wp:extent cx="5334000" cy="3333750"/>
             <wp:effectExtent l="0" t="0" r="0" b="0"/>
             <wp:docPr id="19" name="conges" descr="Congés : demandes, validations à faire et solde de jours." title="Congés : demandes, validations à faire et solde de jours."/>
@@ -14569,7 +14569,7 @@
           <w:left w:w="10" w:type="dxa"/>
           <w:right w:w="10" w:type="dxa"/>
         </w:tblCellMar>
-        <w:tblLook w:val="04A0" w:firstRow="1" w:lastRow="0" w:firstColumn="1" w:lastColumn="0" w:noHBand="0" w:noVBand="1"/>
+        <w:tblLook w:val="0000" w:firstRow="0" w:lastRow="0" w:firstColumn="0" w:lastColumn="0" w:noHBand="0" w:noVBand="0"/>
       </w:tblPr>
       <w:tblGrid>
         <w:gridCol w:w="9638"/>
@@ -14649,7 +14649,7 @@
           <w:left w:w="10" w:type="dxa"/>
           <w:right w:w="10" w:type="dxa"/>
         </w:tblCellMar>
-        <w:tblLook w:val="04A0" w:firstRow="1" w:lastRow="0" w:firstColumn="1" w:lastColumn="0" w:noHBand="0" w:noVBand="1"/>
+        <w:tblLook w:val="0000" w:firstRow="0" w:lastRow="0" w:firstColumn="0" w:lastColumn="0" w:noHBand="0" w:noVBand="0"/>
       </w:tblPr>
       <w:tblGrid>
         <w:gridCol w:w="9638"/>
@@ -14719,7 +14719,7 @@
       <w:pPr>
         <w:pStyle w:val="Titre2"/>
       </w:pPr>
-      <w:bookmarkStart w:id="21" w:name="_Toc240902369"/>
+      <w:bookmarkStart w:id="21" w:name="_Toc240904056"/>
       <w:r>
         <w:t>5.9 Facturation et dépenses</w:t>
       </w:r>
@@ -14745,7 +14745,7 @@
           <w:noProof/>
         </w:rPr>
         <w:drawing>
-          <wp:inline distT="0" distB="0" distL="0" distR="0" wp14:anchorId="4ED6C026" wp14:editId="1F965217">
+          <wp:inline distT="0" distB="0" distL="0" distR="0" wp14:anchorId="16E2553A" wp14:editId="03EC5390">
             <wp:extent cx="5143500" cy="3571875"/>
             <wp:effectExtent l="0" t="0" r="0" b="0"/>
             <wp:docPr id="20" name="facture" descr="Une facture à valider : lignes, TVA, total et conditions de paiement." title="Une facture à valider : lignes, TVA, total et conditions de paiement."/>
@@ -15079,7 +15079,7 @@
           <w:left w:w="10" w:type="dxa"/>
           <w:right w:w="10" w:type="dxa"/>
         </w:tblCellMar>
-        <w:tblLook w:val="04A0" w:firstRow="1" w:lastRow="0" w:firstColumn="1" w:lastColumn="0" w:noHBand="0" w:noVBand="1"/>
+        <w:tblLook w:val="0000" w:firstRow="0" w:lastRow="0" w:firstColumn="0" w:lastColumn="0" w:noHBand="0" w:noVBand="0"/>
       </w:tblPr>
       <w:tblGrid>
         <w:gridCol w:w="9638"/>
@@ -15159,7 +15159,7 @@
           <w:left w:w="10" w:type="dxa"/>
           <w:right w:w="10" w:type="dxa"/>
         </w:tblCellMar>
-        <w:tblLook w:val="04A0" w:firstRow="1" w:lastRow="0" w:firstColumn="1" w:lastColumn="0" w:noHBand="0" w:noVBand="1"/>
+        <w:tblLook w:val="0000" w:firstRow="0" w:lastRow="0" w:firstColumn="0" w:lastColumn="0" w:noHBand="0" w:noVBand="0"/>
       </w:tblPr>
       <w:tblGrid>
         <w:gridCol w:w="9638"/>
@@ -15228,7 +15228,7 @@
       <w:pPr>
         <w:pStyle w:val="Titre2"/>
       </w:pPr>
-      <w:bookmarkStart w:id="22" w:name="_Toc240902370"/>
+      <w:bookmarkStart w:id="22" w:name="_Toc240904057"/>
       <w:r>
         <w:t>5.10 Trésorerie et indicateurs financiers</w:t>
       </w:r>
@@ -15254,7 +15254,7 @@
           <w:noProof/>
         </w:rPr>
         <w:drawing>
-          <wp:inline distT="0" distB="0" distL="0" distR="0" wp14:anchorId="64D7FF7D" wp14:editId="4D715505">
+          <wp:inline distT="0" distB="0" distL="0" distR="0" wp14:anchorId="1C4E655A" wp14:editId="0692DD5B">
             <wp:extent cx="5334000" cy="3333750"/>
             <wp:effectExtent l="0" t="0" r="0" b="0"/>
             <wp:docPr id="21" name="tresorerie" descr="Trésorerie : soldes par compte et journal des mouvements." title="Trésorerie : soldes par compte et journal des mouvements."/>
@@ -15506,7 +15506,7 @@
           <w:left w:w="10" w:type="dxa"/>
           <w:right w:w="10" w:type="dxa"/>
         </w:tblCellMar>
-        <w:tblLook w:val="04A0" w:firstRow="1" w:lastRow="0" w:firstColumn="1" w:lastColumn="0" w:noHBand="0" w:noVBand="1"/>
+        <w:tblLook w:val="0000" w:firstRow="0" w:lastRow="0" w:firstColumn="0" w:lastColumn="0" w:noHBand="0" w:noVBand="0"/>
       </w:tblPr>
       <w:tblGrid>
         <w:gridCol w:w="9638"/>
@@ -15586,7 +15586,7 @@
           <w:left w:w="10" w:type="dxa"/>
           <w:right w:w="10" w:type="dxa"/>
         </w:tblCellMar>
-        <w:tblLook w:val="04A0" w:firstRow="1" w:lastRow="0" w:firstColumn="1" w:lastColumn="0" w:noHBand="0" w:noVBand="1"/>
+        <w:tblLook w:val="0000" w:firstRow="0" w:lastRow="0" w:firstColumn="0" w:lastColumn="0" w:noHBand="0" w:noVBand="0"/>
       </w:tblPr>
       <w:tblGrid>
         <w:gridCol w:w="9638"/>
@@ -15655,7 +15655,7 @@
       <w:pPr>
         <w:pStyle w:val="Titre2"/>
       </w:pPr>
-      <w:bookmarkStart w:id="23" w:name="_Toc240902371"/>
+      <w:bookmarkStart w:id="23" w:name="_Toc240904058"/>
       <w:r>
         <w:t>5.11 Tableau de bord et notifications</w:t>
       </w:r>
@@ -15891,7 +15891,7 @@
           <w:left w:w="10" w:type="dxa"/>
           <w:right w:w="10" w:type="dxa"/>
         </w:tblCellMar>
-        <w:tblLook w:val="04A0" w:firstRow="1" w:lastRow="0" w:firstColumn="1" w:lastColumn="0" w:noHBand="0" w:noVBand="1"/>
+        <w:tblLook w:val="0000" w:firstRow="0" w:lastRow="0" w:firstColumn="0" w:lastColumn="0" w:noHBand="0" w:noVBand="0"/>
       </w:tblPr>
       <w:tblGrid>
         <w:gridCol w:w="9638"/>
@@ -15961,7 +15961,7 @@
       <w:pPr>
         <w:pStyle w:val="Titre2"/>
       </w:pPr>
-      <w:bookmarkStart w:id="24" w:name="_Toc240902372"/>
+      <w:bookmarkStart w:id="24" w:name="_Toc240904059"/>
       <w:r>
         <w:t>5.12 Espace chauffeur sur téléphone</w:t>
       </w:r>
@@ -15990,7 +15990,7 @@
           <w:left w:w="10" w:type="dxa"/>
           <w:right w:w="10" w:type="dxa"/>
         </w:tblCellMar>
-        <w:tblLook w:val="04A0" w:firstRow="1" w:lastRow="0" w:firstColumn="1" w:lastColumn="0" w:noHBand="0" w:noVBand="1"/>
+        <w:tblLook w:val="0000" w:firstRow="0" w:lastRow="0" w:firstColumn="0" w:lastColumn="0" w:noHBand="0" w:noVBand="0"/>
       </w:tblPr>
       <w:tblGrid>
         <w:gridCol w:w="3212"/>
@@ -16027,7 +16027,7 @@
                 <w:noProof/>
               </w:rPr>
               <w:drawing>
-                <wp:inline distT="0" distB="0" distL="0" distR="0" wp14:anchorId="0FD78F44" wp14:editId="5B9FCD23">
+                <wp:inline distT="0" distB="0" distL="0" distR="0" wp14:anchorId="4B428D40" wp14:editId="5331BBFF">
                   <wp:extent cx="1847850" cy="4000500"/>
                   <wp:effectExtent l="0" t="0" r="0" b="0"/>
                   <wp:docPr id="22" name="mobile_accueil" descr="Accueil du chauffeur" title="Accueil du chauffeur"/>
@@ -16103,7 +16103,7 @@
                 <w:noProof/>
               </w:rPr>
               <w:drawing>
-                <wp:inline distT="0" distB="0" distL="0" distR="0" wp14:anchorId="1C8DA2B7" wp14:editId="00A808A5">
+                <wp:inline distT="0" distB="0" distL="0" distR="0" wp14:anchorId="3606071F" wp14:editId="204BEFCE">
                   <wp:extent cx="1847850" cy="4000500"/>
                   <wp:effectExtent l="0" t="0" r="0" b="0"/>
                   <wp:docPr id="23" name="mobile_mission" descr="Une mission, prête à démarrer" title="Une mission, prête à démarrer"/>
@@ -16179,7 +16179,7 @@
                 <w:noProof/>
               </w:rPr>
               <w:drawing>
-                <wp:inline distT="0" distB="0" distL="0" distR="0" wp14:anchorId="49606454" wp14:editId="11F5C1D0">
+                <wp:inline distT="0" distB="0" distL="0" distR="0" wp14:anchorId="1C3B6683" wp14:editId="2DD87DAB">
                   <wp:extent cx="1847850" cy="4000500"/>
                   <wp:effectExtent l="0" t="0" r="0" b="0"/>
                   <wp:docPr id="24" name="mobile_checklist" descr="Check-list du camion" title="Check-list du camion"/>
@@ -16545,7 +16545,7 @@
           <w:left w:w="10" w:type="dxa"/>
           <w:right w:w="10" w:type="dxa"/>
         </w:tblCellMar>
-        <w:tblLook w:val="04A0" w:firstRow="1" w:lastRow="0" w:firstColumn="1" w:lastColumn="0" w:noHBand="0" w:noVBand="1"/>
+        <w:tblLook w:val="0000" w:firstRow="0" w:lastRow="0" w:firstColumn="0" w:lastColumn="0" w:noHBand="0" w:noVBand="0"/>
       </w:tblPr>
       <w:tblGrid>
         <w:gridCol w:w="9638"/>
@@ -16625,7 +16625,7 @@
           <w:left w:w="10" w:type="dxa"/>
           <w:right w:w="10" w:type="dxa"/>
         </w:tblCellMar>
-        <w:tblLook w:val="04A0" w:firstRow="1" w:lastRow="0" w:firstColumn="1" w:lastColumn="0" w:noHBand="0" w:noVBand="1"/>
+        <w:tblLook w:val="0000" w:firstRow="0" w:lastRow="0" w:firstColumn="0" w:lastColumn="0" w:noHBand="0" w:noVBand="0"/>
       </w:tblPr>
       <w:tblGrid>
         <w:gridCol w:w="9638"/>
@@ -16694,7 +16694,7 @@
       <w:pPr>
         <w:pStyle w:val="Titre2"/>
       </w:pPr>
-      <w:bookmarkStart w:id="25" w:name="_Toc240902373"/>
+      <w:bookmarkStart w:id="25" w:name="_Toc240904060"/>
       <w:r>
         <w:t>5.13 Sécurité, traçabilité et API</w:t>
       </w:r>
@@ -16743,7 +16743,7 @@
         <w:t>ni être modifié ni effacé</w:t>
       </w:r>
       <w:r>
-        <w:t xml:space="preserve"> et se conserve au moins cinq ans. L’Administrateur et la Direction le consultent (lecture seule).</w:t>
+        <w:t xml:space="preserve"> et se conserve au moins cinq ans. L’Administrateur le consulte dans l’espace d’administration ; la Direction peut le consulter en lecture seule dès que cet accès est activé sur son compte.</w:t>
       </w:r>
     </w:p>
     <w:p>
@@ -16866,7 +16866,7 @@
           <w:left w:w="10" w:type="dxa"/>
           <w:right w:w="10" w:type="dxa"/>
         </w:tblCellMar>
-        <w:tblLook w:val="04A0" w:firstRow="1" w:lastRow="0" w:firstColumn="1" w:lastColumn="0" w:noHBand="0" w:noVBand="1"/>
+        <w:tblLook w:val="0000" w:firstRow="0" w:lastRow="0" w:firstColumn="0" w:lastColumn="0" w:noHBand="0" w:noVBand="0"/>
       </w:tblPr>
       <w:tblGrid>
         <w:gridCol w:w="9638"/>
@@ -16940,7 +16940,7 @@
       <w:pPr>
         <w:pStyle w:val="Titre1"/>
       </w:pPr>
-      <w:bookmarkStart w:id="26" w:name="_Toc240902374"/>
+      <w:bookmarkStart w:id="26" w:name="_Toc240904061"/>
       <w:r>
         <w:lastRenderedPageBreak/>
         <w:t>6. Un exemple complet : une mission, de la demande à l’encaissement</w:t>
@@ -16970,7 +16970,7 @@
           <w:left w:w="10" w:type="dxa"/>
           <w:right w:w="10" w:type="dxa"/>
         </w:tblCellMar>
-        <w:tblLook w:val="04A0" w:firstRow="1" w:lastRow="0" w:firstColumn="1" w:lastColumn="0" w:noHBand="0" w:noVBand="1"/>
+        <w:tblLook w:val="0000" w:firstRow="0" w:lastRow="0" w:firstColumn="0" w:lastColumn="0" w:noHBand="0" w:noVBand="0"/>
       </w:tblPr>
       <w:tblGrid>
         <w:gridCol w:w="700"/>
@@ -18116,7 +18116,7 @@
       <w:pPr>
         <w:pStyle w:val="Titre1"/>
       </w:pPr>
-      <w:bookmarkStart w:id="27" w:name="_Toc240902375"/>
+      <w:bookmarkStart w:id="27" w:name="_Toc240904062"/>
       <w:r>
         <w:lastRenderedPageBreak/>
         <w:t>7. Ce qui n’est pas encore fait</w:t>
@@ -18155,7 +18155,7 @@
       <w:pPr>
         <w:pStyle w:val="Titre2"/>
       </w:pPr>
-      <w:bookmarkStart w:id="28" w:name="_Toc240902376"/>
+      <w:bookmarkStart w:id="28" w:name="_Toc240904063"/>
       <w:r>
         <w:t>7.1 Décisions prises avec vous</w:t>
       </w:r>
@@ -18176,7 +18176,7 @@
           <w:left w:w="10" w:type="dxa"/>
           <w:right w:w="10" w:type="dxa"/>
         </w:tblCellMar>
-        <w:tblLook w:val="04A0" w:firstRow="1" w:lastRow="0" w:firstColumn="1" w:lastColumn="0" w:noHBand="0" w:noVBand="1"/>
+        <w:tblLook w:val="0000" w:firstRow="0" w:lastRow="0" w:firstColumn="0" w:lastColumn="0" w:noHBand="0" w:noVBand="0"/>
       </w:tblPr>
       <w:tblGrid>
         <w:gridCol w:w="2400"/>
@@ -18720,7 +18720,7 @@
       <w:pPr>
         <w:pStyle w:val="Titre2"/>
       </w:pPr>
-      <w:bookmarkStart w:id="29" w:name="_Toc240902377"/>
+      <w:bookmarkStart w:id="29" w:name="_Toc240904064"/>
       <w:r>
         <w:t>7.2 Prévu avant la mise en service</w:t>
       </w:r>
@@ -18855,7 +18855,7 @@
       <w:pPr>
         <w:pStyle w:val="Titre2"/>
       </w:pPr>
-      <w:bookmarkStart w:id="30" w:name="_Toc240902378"/>
+      <w:bookmarkStart w:id="30" w:name="_Toc240904065"/>
       <w:r>
         <w:t>7.3 Améliorations possibles ensuite</w:t>
       </w:r>
@@ -18960,7 +18960,7 @@
           <w:left w:w="10" w:type="dxa"/>
           <w:right w:w="10" w:type="dxa"/>
         </w:tblCellMar>
-        <w:tblLook w:val="04A0" w:firstRow="1" w:lastRow="0" w:firstColumn="1" w:lastColumn="0" w:noHBand="0" w:noVBand="1"/>
+        <w:tblLook w:val="0000" w:firstRow="0" w:lastRow="0" w:firstColumn="0" w:lastColumn="0" w:noHBand="0" w:noVBand="0"/>
       </w:tblPr>
       <w:tblGrid>
         <w:gridCol w:w="9638"/>
@@ -19045,7 +19045,7 @@
       <w:pPr>
         <w:pStyle w:val="Titre1"/>
       </w:pPr>
-      <w:bookmarkStart w:id="31" w:name="_Toc240902379"/>
+      <w:bookmarkStart w:id="31" w:name="_Toc240904066"/>
       <w:r>
         <w:t>8. Points à valider avec vous</w:t>
       </w:r>
@@ -19074,7 +19074,7 @@
           <w:left w:w="10" w:type="dxa"/>
           <w:right w:w="10" w:type="dxa"/>
         </w:tblCellMar>
-        <w:tblLook w:val="04A0" w:firstRow="1" w:lastRow="0" w:firstColumn="1" w:lastColumn="0" w:noHBand="0" w:noVBand="1"/>
+        <w:tblLook w:val="0000" w:firstRow="0" w:lastRow="0" w:firstColumn="0" w:lastColumn="0" w:noHBand="0" w:noVBand="0"/>
       </w:tblPr>
       <w:tblGrid>
         <w:gridCol w:w="3000"/>
@@ -20199,10 +20199,216 @@
 <file path=word/numbering.xml><?xml version="1.0" encoding="utf-8"?>
 <w:numbering xmlns:wpc="http://schemas.microsoft.com/office/word/2010/wordprocessingCanvas" xmlns:cx="http://schemas.microsoft.com/office/drawing/2014/chartex" xmlns:cx1="http://schemas.microsoft.com/office/drawing/2015/9/8/chartex" xmlns:cx2="http://schemas.microsoft.com/office/drawing/2015/10/21/chartex" xmlns:cx3="http://schemas.microsoft.com/office/drawing/2016/5/9/chartex" xmlns:cx4="http://schemas.microsoft.com/office/drawing/2016/5/10/chartex" xmlns:cx5="http://schemas.microsoft.com/office/drawing/2016/5/11/chartex" xmlns:cx6="http://schemas.microsoft.com/office/drawing/2016/5/12/chartex" xmlns:cx7="http://schemas.microsoft.com/office/drawing/2016/5/13/chartex" xmlns:cx8="http://schemas.microsoft.com/office/drawing/2016/5/14/chartex" xmlns:mc="http://schemas.openxmlformats.org/markup-compatibility/2006" xmlns:aink="http://schemas.microsoft.com/office/drawing/2016/ink" xmlns:am3d="http://schemas.microsoft.com/office/drawing/2017/model3d" xmlns:o="urn:schemas-microsoft-com:office:office" xmlns:oel="http://schemas.microsoft.com/office/2019/extlst" xmlns:r="http://schemas.openxmlformats.org/officeDocument/2006/relationships" xmlns:m="http://schemas.openxmlformats.org/officeDocument/2006/math" xmlns:v="urn:schemas-microsoft-com:vml" xmlns:wp14="http://schemas.microsoft.com/office/word/2010/wordprocessingDrawing" xmlns:wp="http://schemas.openxmlformats.org/drawingml/2006/wordprocessingDrawing" xmlns:w10="urn:schemas-microsoft-com:office:word" xmlns:w="http://schemas.openxmlformats.org/wordprocessingml/2006/main" xmlns:w14="http://schemas.microsoft.com/office/word/2010/wordml" xmlns:w15="http://schemas.microsoft.com/office/word/2012/wordml" xmlns:w16cex="http://schemas.microsoft.com/office/word/2018/wordml/cex" xmlns:w16cid="http://schemas.microsoft.com/office/word/2016/wordml/cid" xmlns:w16="http://schemas.microsoft.com/office/word/2018/wordml" xmlns:w16sdtdh="http://schemas.microsoft.com/office/word/2020/wordml/sdtdatahash" xmlns:w16se="http://schemas.microsoft.com/office/word/2015/wordml/symex" xmlns:wpg="http://schemas.microsoft.com/office/word/2010/wordprocessingGroup" xmlns:wpi="http://schemas.microsoft.com/office/word/2010/wordprocessingInk" xmlns:wne="http://schemas.microsoft.com/office/word/2006/wordml" xmlns:wps="http://schemas.microsoft.com/office/word/2010/wordprocessingShape" mc:Ignorable="w14 w15 w16se w16cid w16 w16cex w16sdtdh wp14">
   <w:abstractNum w:abstractNumId="0" w15:restartNumberingAfterBreak="0">
-    <w:nsid w:val="165F6E9E"/>
+    <w:nsid w:val="12FA273B"/>
     <w:multiLevelType w:val="hybridMultilevel"/>
-    <w:tmpl w:val="FDEC109E"/>
-    <w:lvl w:ilvl="0" w:tplc="F4C27058">
+    <w:tmpl w:val="5ABC5D92"/>
+    <w:lvl w:ilvl="0" w:tplc="28A0D004">
+      <w:start w:val="1"/>
+      <w:numFmt w:val="bullet"/>
+      <w:lvlText w:val="●"/>
+      <w:lvlJc w:val="left"/>
+      <w:pPr>
+        <w:ind w:left="720" w:hanging="360"/>
+      </w:pPr>
+    </w:lvl>
+    <w:lvl w:ilvl="1" w:tplc="A5FC40C6">
+      <w:start w:val="1"/>
+      <w:numFmt w:val="bullet"/>
+      <w:lvlText w:val="○"/>
+      <w:lvlJc w:val="left"/>
+      <w:pPr>
+        <w:ind w:left="1440" w:hanging="360"/>
+      </w:pPr>
+    </w:lvl>
+    <w:lvl w:ilvl="2" w:tplc="7E4A4602">
+      <w:start w:val="1"/>
+      <w:numFmt w:val="bullet"/>
+      <w:lvlText w:val="■"/>
+      <w:lvlJc w:val="left"/>
+      <w:pPr>
+        <w:ind w:left="2160" w:hanging="360"/>
+      </w:pPr>
+    </w:lvl>
+    <w:lvl w:ilvl="3" w:tplc="08B6A570">
+      <w:start w:val="1"/>
+      <w:numFmt w:val="bullet"/>
+      <w:lvlText w:val="●"/>
+      <w:lvlJc w:val="left"/>
+      <w:pPr>
+        <w:ind w:left="2880" w:hanging="360"/>
+      </w:pPr>
+    </w:lvl>
+    <w:lvl w:ilvl="4" w:tplc="21E2547C">
+      <w:start w:val="1"/>
+      <w:numFmt w:val="bullet"/>
+      <w:lvlText w:val="○"/>
+      <w:lvlJc w:val="left"/>
+      <w:pPr>
+        <w:ind w:left="3600" w:hanging="360"/>
+      </w:pPr>
+    </w:lvl>
+    <w:lvl w:ilvl="5" w:tplc="806C30BA">
+      <w:start w:val="1"/>
+      <w:numFmt w:val="bullet"/>
+      <w:lvlText w:val="■"/>
+      <w:lvlJc w:val="left"/>
+      <w:pPr>
+        <w:ind w:left="4320" w:hanging="360"/>
+      </w:pPr>
+    </w:lvl>
+    <w:lvl w:ilvl="6" w:tplc="A760B708">
+      <w:start w:val="1"/>
+      <w:numFmt w:val="bullet"/>
+      <w:lvlText w:val="●"/>
+      <w:lvlJc w:val="left"/>
+      <w:pPr>
+        <w:ind w:left="5040" w:hanging="360"/>
+      </w:pPr>
+    </w:lvl>
+    <w:lvl w:ilvl="7" w:tplc="408241CC">
+      <w:start w:val="1"/>
+      <w:numFmt w:val="bullet"/>
+      <w:lvlText w:val="●"/>
+      <w:lvlJc w:val="left"/>
+      <w:pPr>
+        <w:ind w:left="5760" w:hanging="360"/>
+      </w:pPr>
+    </w:lvl>
+    <w:lvl w:ilvl="8" w:tplc="A9B89334">
+      <w:start w:val="1"/>
+      <w:numFmt w:val="bullet"/>
+      <w:lvlText w:val="●"/>
+      <w:lvlJc w:val="left"/>
+      <w:pPr>
+        <w:ind w:left="6480" w:hanging="360"/>
+      </w:pPr>
+    </w:lvl>
+  </w:abstractNum>
+  <w:abstractNum w:abstractNumId="1" w15:restartNumberingAfterBreak="0">
+    <w:nsid w:val="6D521F3F"/>
+    <w:multiLevelType w:val="hybridMultilevel"/>
+    <w:tmpl w:val="DA9ACB72"/>
+    <w:lvl w:ilvl="0" w:tplc="8A4041C8">
+      <w:start w:val="1"/>
+      <w:numFmt w:val="bullet"/>
+      <w:lvlText w:val="✕"/>
+      <w:lvlJc w:val="left"/>
+      <w:pPr>
+        <w:ind w:left="340" w:hanging="260"/>
+      </w:pPr>
+      <w:rPr>
+        <w:b/>
+        <w:bCs/>
+        <w:color w:val="8A8A8A"/>
+      </w:rPr>
+    </w:lvl>
+    <w:lvl w:ilvl="1" w:tplc="2A8223A4">
+      <w:numFmt w:val="decimal"/>
+      <w:lvlText w:val=""/>
+      <w:lvlJc w:val="left"/>
+    </w:lvl>
+    <w:lvl w:ilvl="2" w:tplc="C616D94C">
+      <w:numFmt w:val="decimal"/>
+      <w:lvlText w:val=""/>
+      <w:lvlJc w:val="left"/>
+    </w:lvl>
+    <w:lvl w:ilvl="3" w:tplc="E2126D42">
+      <w:numFmt w:val="decimal"/>
+      <w:lvlText w:val=""/>
+      <w:lvlJc w:val="left"/>
+    </w:lvl>
+    <w:lvl w:ilvl="4" w:tplc="F97CBC84">
+      <w:numFmt w:val="decimal"/>
+      <w:lvlText w:val=""/>
+      <w:lvlJc w:val="left"/>
+    </w:lvl>
+    <w:lvl w:ilvl="5" w:tplc="8EBC5DEC">
+      <w:numFmt w:val="decimal"/>
+      <w:lvlText w:val=""/>
+      <w:lvlJc w:val="left"/>
+    </w:lvl>
+    <w:lvl w:ilvl="6" w:tplc="8B2E0426">
+      <w:numFmt w:val="decimal"/>
+      <w:lvlText w:val=""/>
+      <w:lvlJc w:val="left"/>
+    </w:lvl>
+    <w:lvl w:ilvl="7" w:tplc="9E606FC4">
+      <w:numFmt w:val="decimal"/>
+      <w:lvlText w:val=""/>
+      <w:lvlJc w:val="left"/>
+    </w:lvl>
+    <w:lvl w:ilvl="8" w:tplc="4C9A2954">
+      <w:numFmt w:val="decimal"/>
+      <w:lvlText w:val=""/>
+      <w:lvlJc w:val="left"/>
+    </w:lvl>
+  </w:abstractNum>
+  <w:abstractNum w:abstractNumId="2" w15:restartNumberingAfterBreak="0">
+    <w:nsid w:val="77204799"/>
+    <w:multiLevelType w:val="hybridMultilevel"/>
+    <w:tmpl w:val="EC365E12"/>
+    <w:lvl w:ilvl="0" w:tplc="72E07774">
+      <w:start w:val="1"/>
+      <w:numFmt w:val="bullet"/>
+      <w:lvlText w:val="•"/>
+      <w:lvlJc w:val="left"/>
+      <w:pPr>
+        <w:ind w:left="540" w:hanging="270"/>
+      </w:pPr>
+      <w:rPr>
+        <w:color w:val="F28A14"/>
+      </w:rPr>
+    </w:lvl>
+    <w:lvl w:ilvl="1" w:tplc="FB0812F6">
+      <w:start w:val="1"/>
+      <w:numFmt w:val="bullet"/>
+      <w:lvlText w:val="–"/>
+      <w:lvlJc w:val="left"/>
+      <w:pPr>
+        <w:ind w:left="1000" w:hanging="270"/>
+      </w:pPr>
+    </w:lvl>
+    <w:lvl w:ilvl="2" w:tplc="A55AF7E2">
+      <w:numFmt w:val="decimal"/>
+      <w:lvlText w:val=""/>
+      <w:lvlJc w:val="left"/>
+    </w:lvl>
+    <w:lvl w:ilvl="3" w:tplc="5100EA78">
+      <w:numFmt w:val="decimal"/>
+      <w:lvlText w:val=""/>
+      <w:lvlJc w:val="left"/>
+    </w:lvl>
+    <w:lvl w:ilvl="4" w:tplc="AC407DCC">
+      <w:numFmt w:val="decimal"/>
+      <w:lvlText w:val=""/>
+      <w:lvlJc w:val="left"/>
+    </w:lvl>
+    <w:lvl w:ilvl="5" w:tplc="7BF4B506">
+      <w:numFmt w:val="decimal"/>
+      <w:lvlText w:val=""/>
+      <w:lvlJc w:val="left"/>
+    </w:lvl>
+    <w:lvl w:ilvl="6" w:tplc="144AE28E">
+      <w:numFmt w:val="decimal"/>
+      <w:lvlText w:val=""/>
+      <w:lvlJc w:val="left"/>
+    </w:lvl>
+    <w:lvl w:ilvl="7" w:tplc="DE40B908">
+      <w:numFmt w:val="decimal"/>
+      <w:lvlText w:val=""/>
+      <w:lvlJc w:val="left"/>
+    </w:lvl>
+    <w:lvl w:ilvl="8" w:tplc="0FA45BB8">
+      <w:numFmt w:val="decimal"/>
+      <w:lvlText w:val=""/>
+      <w:lvlJc w:val="left"/>
+    </w:lvl>
+  </w:abstractNum>
+  <w:abstractNum w:abstractNumId="3" w15:restartNumberingAfterBreak="0">
+    <w:nsid w:val="7A5723D1"/>
+    <w:multiLevelType w:val="hybridMultilevel"/>
+    <w:tmpl w:val="7242B836"/>
+    <w:lvl w:ilvl="0" w:tplc="6CB6F76E">
       <w:start w:val="1"/>
       <w:numFmt w:val="bullet"/>
       <w:lvlText w:val="✓"/>
@@ -20216,273 +20422,67 @@
         <w:color w:val="1B5E20"/>
       </w:rPr>
     </w:lvl>
-    <w:lvl w:ilvl="1" w:tplc="82382E16">
+    <w:lvl w:ilvl="1" w:tplc="E59C1454">
       <w:numFmt w:val="decimal"/>
       <w:lvlText w:val=""/>
       <w:lvlJc w:val="left"/>
     </w:lvl>
-    <w:lvl w:ilvl="2" w:tplc="8FCAA3C8">
+    <w:lvl w:ilvl="2" w:tplc="5FE2C18A">
       <w:numFmt w:val="decimal"/>
       <w:lvlText w:val=""/>
       <w:lvlJc w:val="left"/>
     </w:lvl>
-    <w:lvl w:ilvl="3" w:tplc="CE94A47A">
+    <w:lvl w:ilvl="3" w:tplc="4B08DA90">
       <w:numFmt w:val="decimal"/>
       <w:lvlText w:val=""/>
       <w:lvlJc w:val="left"/>
     </w:lvl>
-    <w:lvl w:ilvl="4" w:tplc="8836E80A">
+    <w:lvl w:ilvl="4" w:tplc="80A6FDC4">
       <w:numFmt w:val="decimal"/>
       <w:lvlText w:val=""/>
       <w:lvlJc w:val="left"/>
     </w:lvl>
-    <w:lvl w:ilvl="5" w:tplc="69181556">
+    <w:lvl w:ilvl="5" w:tplc="0B8EB78C">
       <w:numFmt w:val="decimal"/>
       <w:lvlText w:val=""/>
       <w:lvlJc w:val="left"/>
     </w:lvl>
-    <w:lvl w:ilvl="6" w:tplc="F2740EAE">
+    <w:lvl w:ilvl="6" w:tplc="05981708">
       <w:numFmt w:val="decimal"/>
       <w:lvlText w:val=""/>
       <w:lvlJc w:val="left"/>
     </w:lvl>
-    <w:lvl w:ilvl="7" w:tplc="AA82CDD4">
+    <w:lvl w:ilvl="7" w:tplc="D7CAE94A">
       <w:numFmt w:val="decimal"/>
       <w:lvlText w:val=""/>
       <w:lvlJc w:val="left"/>
     </w:lvl>
-    <w:lvl w:ilvl="8" w:tplc="CA3045F6">
+    <w:lvl w:ilvl="8" w:tplc="3E4C5FFC">
       <w:numFmt w:val="decimal"/>
       <w:lvlText w:val=""/>
       <w:lvlJc w:val="left"/>
     </w:lvl>
   </w:abstractNum>
-  <w:abstractNum w:abstractNumId="1" w15:restartNumberingAfterBreak="0">
-    <w:nsid w:val="620513AE"/>
-    <w:multiLevelType w:val="hybridMultilevel"/>
-    <w:tmpl w:val="5C6CF4F2"/>
-    <w:lvl w:ilvl="0" w:tplc="9B080B8A">
-      <w:start w:val="1"/>
-      <w:numFmt w:val="bullet"/>
-      <w:lvlText w:val="●"/>
-      <w:lvlJc w:val="left"/>
-      <w:pPr>
-        <w:ind w:left="720" w:hanging="360"/>
-      </w:pPr>
-    </w:lvl>
-    <w:lvl w:ilvl="1" w:tplc="24FAFDAC">
-      <w:start w:val="1"/>
-      <w:numFmt w:val="bullet"/>
-      <w:lvlText w:val="○"/>
-      <w:lvlJc w:val="left"/>
-      <w:pPr>
-        <w:ind w:left="1440" w:hanging="360"/>
-      </w:pPr>
-    </w:lvl>
-    <w:lvl w:ilvl="2" w:tplc="61E8957A">
-      <w:start w:val="1"/>
-      <w:numFmt w:val="bullet"/>
-      <w:lvlText w:val="■"/>
-      <w:lvlJc w:val="left"/>
-      <w:pPr>
-        <w:ind w:left="2160" w:hanging="360"/>
-      </w:pPr>
-    </w:lvl>
-    <w:lvl w:ilvl="3" w:tplc="F4643B38">
-      <w:start w:val="1"/>
-      <w:numFmt w:val="bullet"/>
-      <w:lvlText w:val="●"/>
-      <w:lvlJc w:val="left"/>
-      <w:pPr>
-        <w:ind w:left="2880" w:hanging="360"/>
-      </w:pPr>
-    </w:lvl>
-    <w:lvl w:ilvl="4" w:tplc="334A15AC">
-      <w:start w:val="1"/>
-      <w:numFmt w:val="bullet"/>
-      <w:lvlText w:val="○"/>
-      <w:lvlJc w:val="left"/>
-      <w:pPr>
-        <w:ind w:left="3600" w:hanging="360"/>
-      </w:pPr>
-    </w:lvl>
-    <w:lvl w:ilvl="5" w:tplc="C06EC17C">
-      <w:start w:val="1"/>
-      <w:numFmt w:val="bullet"/>
-      <w:lvlText w:val="■"/>
-      <w:lvlJc w:val="left"/>
-      <w:pPr>
-        <w:ind w:left="4320" w:hanging="360"/>
-      </w:pPr>
-    </w:lvl>
-    <w:lvl w:ilvl="6" w:tplc="528E8ADE">
-      <w:start w:val="1"/>
-      <w:numFmt w:val="bullet"/>
-      <w:lvlText w:val="●"/>
-      <w:lvlJc w:val="left"/>
-      <w:pPr>
-        <w:ind w:left="5040" w:hanging="360"/>
-      </w:pPr>
-    </w:lvl>
-    <w:lvl w:ilvl="7" w:tplc="002021D8">
-      <w:start w:val="1"/>
-      <w:numFmt w:val="bullet"/>
-      <w:lvlText w:val="●"/>
-      <w:lvlJc w:val="left"/>
-      <w:pPr>
-        <w:ind w:left="5760" w:hanging="360"/>
-      </w:pPr>
-    </w:lvl>
-    <w:lvl w:ilvl="8" w:tplc="A33499C2">
-      <w:start w:val="1"/>
-      <w:numFmt w:val="bullet"/>
-      <w:lvlText w:val="●"/>
-      <w:lvlJc w:val="left"/>
-      <w:pPr>
-        <w:ind w:left="6480" w:hanging="360"/>
-      </w:pPr>
-    </w:lvl>
-  </w:abstractNum>
-  <w:abstractNum w:abstractNumId="2" w15:restartNumberingAfterBreak="0">
-    <w:nsid w:val="675A4038"/>
-    <w:multiLevelType w:val="hybridMultilevel"/>
-    <w:tmpl w:val="BD8C3700"/>
-    <w:lvl w:ilvl="0" w:tplc="4252CE10">
-      <w:start w:val="1"/>
-      <w:numFmt w:val="bullet"/>
-      <w:lvlText w:val="•"/>
-      <w:lvlJc w:val="left"/>
-      <w:pPr>
-        <w:ind w:left="540" w:hanging="270"/>
-      </w:pPr>
-      <w:rPr>
-        <w:color w:val="F28A14"/>
-      </w:rPr>
-    </w:lvl>
-    <w:lvl w:ilvl="1" w:tplc="BEAC769E">
-      <w:start w:val="1"/>
-      <w:numFmt w:val="bullet"/>
-      <w:lvlText w:val="–"/>
-      <w:lvlJc w:val="left"/>
-      <w:pPr>
-        <w:ind w:left="1000" w:hanging="270"/>
-      </w:pPr>
-    </w:lvl>
-    <w:lvl w:ilvl="2" w:tplc="1F60F094">
-      <w:numFmt w:val="decimal"/>
-      <w:lvlText w:val=""/>
-      <w:lvlJc w:val="left"/>
-    </w:lvl>
-    <w:lvl w:ilvl="3" w:tplc="043A8BEE">
-      <w:numFmt w:val="decimal"/>
-      <w:lvlText w:val=""/>
-      <w:lvlJc w:val="left"/>
-    </w:lvl>
-    <w:lvl w:ilvl="4" w:tplc="A2D654AE">
-      <w:numFmt w:val="decimal"/>
-      <w:lvlText w:val=""/>
-      <w:lvlJc w:val="left"/>
-    </w:lvl>
-    <w:lvl w:ilvl="5" w:tplc="24A64E96">
-      <w:numFmt w:val="decimal"/>
-      <w:lvlText w:val=""/>
-      <w:lvlJc w:val="left"/>
-    </w:lvl>
-    <w:lvl w:ilvl="6" w:tplc="4B6E1F7A">
-      <w:numFmt w:val="decimal"/>
-      <w:lvlText w:val=""/>
-      <w:lvlJc w:val="left"/>
-    </w:lvl>
-    <w:lvl w:ilvl="7" w:tplc="ED72F324">
-      <w:numFmt w:val="decimal"/>
-      <w:lvlText w:val=""/>
-      <w:lvlJc w:val="left"/>
-    </w:lvl>
-    <w:lvl w:ilvl="8" w:tplc="75884A9E">
-      <w:numFmt w:val="decimal"/>
-      <w:lvlText w:val=""/>
-      <w:lvlJc w:val="left"/>
-    </w:lvl>
-  </w:abstractNum>
-  <w:abstractNum w:abstractNumId="3" w15:restartNumberingAfterBreak="0">
-    <w:nsid w:val="6DD00D91"/>
-    <w:multiLevelType w:val="hybridMultilevel"/>
-    <w:tmpl w:val="4C3AD5D0"/>
-    <w:lvl w:ilvl="0" w:tplc="203E4B26">
-      <w:start w:val="1"/>
-      <w:numFmt w:val="bullet"/>
-      <w:lvlText w:val="✕"/>
-      <w:lvlJc w:val="left"/>
-      <w:pPr>
-        <w:ind w:left="340" w:hanging="260"/>
-      </w:pPr>
-      <w:rPr>
-        <w:b/>
-        <w:bCs/>
-        <w:color w:val="8A8A8A"/>
-      </w:rPr>
-    </w:lvl>
-    <w:lvl w:ilvl="1" w:tplc="48401D42">
-      <w:numFmt w:val="decimal"/>
-      <w:lvlText w:val=""/>
-      <w:lvlJc w:val="left"/>
-    </w:lvl>
-    <w:lvl w:ilvl="2" w:tplc="F304844A">
-      <w:numFmt w:val="decimal"/>
-      <w:lvlText w:val=""/>
-      <w:lvlJc w:val="left"/>
-    </w:lvl>
-    <w:lvl w:ilvl="3" w:tplc="AB3E1DA2">
-      <w:numFmt w:val="decimal"/>
-      <w:lvlText w:val=""/>
-      <w:lvlJc w:val="left"/>
-    </w:lvl>
-    <w:lvl w:ilvl="4" w:tplc="40B6E94A">
-      <w:numFmt w:val="decimal"/>
-      <w:lvlText w:val=""/>
-      <w:lvlJc w:val="left"/>
-    </w:lvl>
-    <w:lvl w:ilvl="5" w:tplc="5C7A168E">
-      <w:numFmt w:val="decimal"/>
-      <w:lvlText w:val=""/>
-      <w:lvlJc w:val="left"/>
-    </w:lvl>
-    <w:lvl w:ilvl="6" w:tplc="94DC4A2C">
-      <w:numFmt w:val="decimal"/>
-      <w:lvlText w:val=""/>
-      <w:lvlJc w:val="left"/>
-    </w:lvl>
-    <w:lvl w:ilvl="7" w:tplc="CAC6BF54">
-      <w:numFmt w:val="decimal"/>
-      <w:lvlText w:val=""/>
-      <w:lvlJc w:val="left"/>
-    </w:lvl>
-    <w:lvl w:ilvl="8" w:tplc="9FF04AAA">
-      <w:numFmt w:val="decimal"/>
-      <w:lvlText w:val=""/>
-      <w:lvlJc w:val="left"/>
-    </w:lvl>
-  </w:abstractNum>
-  <w:num w:numId="1" w16cid:durableId="1244757894">
-    <w:abstractNumId w:val="1"/>
+  <w:num w:numId="1" w16cid:durableId="1084649183">
+    <w:abstractNumId w:val="0"/>
     <w:lvlOverride w:ilvl="0">
       <w:startOverride w:val="1"/>
     </w:lvlOverride>
   </w:num>
-  <w:num w:numId="2" w16cid:durableId="993945956">
+  <w:num w:numId="2" w16cid:durableId="852888027">
     <w:abstractNumId w:val="2"/>
     <w:lvlOverride w:ilvl="0">
       <w:startOverride w:val="1"/>
     </w:lvlOverride>
   </w:num>
-  <w:num w:numId="3" w16cid:durableId="107815925">
-    <w:abstractNumId w:val="0"/>
+  <w:num w:numId="3" w16cid:durableId="1634166902">
+    <w:abstractNumId w:val="3"/>
     <w:lvlOverride w:ilvl="0">
       <w:startOverride w:val="1"/>
     </w:lvlOverride>
   </w:num>
-  <w:num w:numId="4" w16cid:durableId="2064980593">
-    <w:abstractNumId w:val="3"/>
+  <w:num w:numId="4" w16cid:durableId="1966308176">
+    <w:abstractNumId w:val="1"/>
     <w:lvlOverride w:ilvl="0">
       <w:startOverride w:val="1"/>
     </w:lvlOverride>
@@ -21108,7 +21108,7 @@
     <w:autoRedefine/>
     <w:uiPriority w:val="39"/>
     <w:unhideWhenUsed/>
-    <w:rsid w:val="00616221"/>
+    <w:rsid w:val="00A70CBD"/>
     <w:pPr>
       <w:spacing w:after="100"/>
     </w:pPr>
@@ -21120,7 +21120,7 @@
     <w:autoRedefine/>
     <w:uiPriority w:val="39"/>
     <w:unhideWhenUsed/>
-    <w:rsid w:val="00616221"/>
+    <w:rsid w:val="00A70CBD"/>
     <w:pPr>
       <w:spacing w:after="100"/>
       <w:ind w:left="220"/>

</xml_diff>